<commit_message>
fix: include and index reviewed MARA locus maps
</commit_message>
<xml_diff>
--- a/reports/Matryoshka-Tn123-definition-and-validation-report.docx
+++ b/reports/Matryoshka-Tn123-definition-and-validation-report.docx
@@ -3738,6 +3738,107 @@
     </w:p>
     <w:p>
       <w:r>
+        <w:rPr>
+          <w:rFonts w:ascii="Calibri" w:hAnsi="Calibri"/>
+          <w:b w:val="0"/>
+          <w:color w:val="182026"/>
+          <w:sz w:val="22"/>
+        </w:rPr>
+        <w:t xml:space="preserve">The seven reviewed definitions have a separate complete bundle at </w:t>
+      </w:r>
+      <w:r>
+        <w:rPr>
+          <w:rFonts w:ascii="Consolas" w:hAnsi="Consolas"/>
+          <w:b w:val="0"/>
+          <w:color w:val="1F4D78"/>
+          <w:sz w:val="20"/>
+        </w:rPr>
+        <w:t>demo-output/tn123-reviewed-definitions/proof-bundle/</w:t>
+      </w:r>
+      <w:r>
+        <w:rPr>
+          <w:rFonts w:ascii="Calibri" w:hAnsi="Calibri"/>
+          <w:b w:val="0"/>
+          <w:color w:val="182026"/>
+          <w:sz w:val="22"/>
+        </w:rPr>
+        <w:t xml:space="preserve">. Its </w:t>
+      </w:r>
+      <w:r>
+        <w:rPr>
+          <w:rFonts w:ascii="Consolas" w:hAnsi="Consolas"/>
+          <w:b w:val="0"/>
+          <w:color w:val="1F4D78"/>
+          <w:sz w:val="20"/>
+        </w:rPr>
+        <w:t>mara/</w:t>
+      </w:r>
+      <w:r>
+        <w:rPr>
+          <w:rFonts w:ascii="Calibri" w:hAnsi="Calibri"/>
+          <w:b w:val="0"/>
+          <w:color w:val="182026"/>
+          <w:sz w:val="22"/>
+        </w:rPr>
+        <w:t xml:space="preserve"> and </w:t>
+      </w:r>
+      <w:r>
+        <w:rPr>
+          <w:rFonts w:ascii="Consolas" w:hAnsi="Consolas"/>
+          <w:b w:val="0"/>
+          <w:color w:val="1F4D78"/>
+          <w:sz w:val="20"/>
+        </w:rPr>
+        <w:t>mara-table/</w:t>
+      </w:r>
+      <w:r>
+        <w:rPr>
+          <w:rFonts w:ascii="Calibri" w:hAnsi="Calibri"/>
+          <w:b w:val="0"/>
+          <w:color w:val="182026"/>
+          <w:sz w:val="22"/>
+        </w:rPr>
+        <w:t xml:space="preserve"> directories contain the accession-specific maps and tables. It contains eight map entries: one for each of the seven whole-element definitions and a separate nested ISEcp1-associated locus within Tn2.1. </w:t>
+      </w:r>
+      <w:r>
+        <w:rPr>
+          <w:rFonts w:ascii="Consolas" w:hAnsi="Consolas"/>
+          <w:b w:val="0"/>
+          <w:color w:val="1F4D78"/>
+          <w:sz w:val="20"/>
+        </w:rPr>
+        <w:t>run.json</w:t>
+      </w:r>
+      <w:r>
+        <w:rPr>
+          <w:rFonts w:ascii="Calibri" w:hAnsi="Calibri"/>
+          <w:b w:val="0"/>
+          <w:color w:val="182026"/>
+          <w:sz w:val="22"/>
+        </w:rPr>
+        <w:t xml:space="preserve"> lists every map explicitly under </w:t>
+      </w:r>
+      <w:r>
+        <w:rPr>
+          <w:rFonts w:ascii="Consolas" w:hAnsi="Consolas"/>
+          <w:b w:val="0"/>
+          <w:color w:val="1F4D78"/>
+          <w:sz w:val="20"/>
+        </w:rPr>
+        <w:t>mara_locus_outputs</w:t>
+      </w:r>
+      <w:r>
+        <w:rPr>
+          <w:rFonts w:ascii="Calibri" w:hAnsi="Calibri"/>
+          <w:b w:val="0"/>
+          <w:color w:val="182026"/>
+          <w:sz w:val="22"/>
+        </w:rPr>
+        <w:t>.</w:t>
+      </w:r>
+    </w:p>
+    <w:p>
+      <w:r>
         <w:br w:type="page"/>
       </w:r>
     </w:p>

</xml_diff>

<commit_message>
Make Tn123 classification component-rule first
</commit_message>
<xml_diff>
--- a/reports/Matryoshka-Tn123-definition-and-validation-report.docx
+++ b/reports/Matryoshka-Tn123-definition-and-validation-report.docx
@@ -1207,7 +1207,7 @@
           <w:color w:val="17212B"/>
           <w:sz w:val="20"/>
         </w:rPr>
-        <w:t>A complete locus is matched to a reviewed whole-element definition; non-identical and incomplete loci are not silently promoted to exact names.</w:t>
+        <w:t>A complete locus is classified from its component grammar and weighted local component profiles; a whole-element comparison is secondary confirmation.</w:t>
       </w:r>
     </w:p>
     <w:p>
@@ -1713,7 +1713,7 @@
                 <w:color w:val="17212B"/>
                 <w:sz w:val="18"/>
               </w:rPr>
-              <w:t>Match definitions</w:t>
+              <w:t>Classify by expert rules</w:t>
             </w:r>
           </w:p>
         </w:tc>
@@ -1740,7 +1740,7 @@
                 <w:color w:val="17212B"/>
                 <w:sz w:val="18"/>
               </w:rPr>
-              <w:t>Compare complete candidates with the reviewed whole-element references and subtype rules.</w:t>
+              <w:t>Score the detected component profiles and assign a type only when the declared threshold and margin are met.</w:t>
             </w:r>
           </w:p>
         </w:tc>
@@ -1796,7 +1796,7 @@
                 <w:color w:val="17212B"/>
                 <w:sz w:val="18"/>
               </w:rPr>
-              <w:t>Refine boundaries</w:t>
+              <w:t>Compare references</w:t>
             </w:r>
           </w:p>
         </w:tc>
@@ -1823,7 +1823,7 @@
                 <w:color w:val="17212B"/>
                 <w:sz w:val="18"/>
               </w:rPr>
-              <w:t>Record terminal-IR and direct-repeat evidence, insertions, deletions and mismatches.</w:t>
+              <w:t>Optionally confirm an exact reviewed definition and record secondary closest-reference context.</w:t>
             </w:r>
           </w:p>
         </w:tc>
@@ -2106,7 +2106,7 @@
                 <w:color w:val="17212B"/>
                 <w:sz w:val="18"/>
               </w:rPr>
-              <w:t>Complete grammar and a clear closest type, but the sequence is not an exact declared definition.</w:t>
+              <w:t>Complete grammar and a clear best weighted component profile, without requiring a complete-element match.</w:t>
             </w:r>
           </w:p>
         </w:tc>
@@ -2218,7 +2218,7 @@
                 <w:color w:val="17212B"/>
                 <w:sz w:val="18"/>
               </w:rPr>
-              <w:t>The group grammar is supported but the closest whole-locus type is not sufficiently distinct.</w:t>
+              <w:t>The group grammar is supported but the component-profile score or type margin is insufficient.</w:t>
             </w:r>
           </w:p>
         </w:tc>
@@ -2326,7 +2326,7 @@
           <w:color w:val="17212B"/>
           <w:sz w:val="21"/>
         </w:rPr>
-        <w:t>The command always performs the validated reference scan when BLAST is available. It searches the input both against whole-element references and against independent component references. Collinear hits are assembled across substitutions and insertions; candidate components are then checked without allowing a whole-locus match to manufacture missing required components.</w:t>
+        <w:t>The command scans independently for the component sequences and assembles their collinear matches across substitutions, insertions and deletions. The expert-rule classifier uses those components to establish the family and type. Under the default validated profile, a separate whole-element comparison is then attached as confirmation or context. The tn123-components profile omits that complete-element lookup entirely.</w:t>
       </w:r>
     </w:p>
     <w:p>
@@ -2480,7 +2480,7 @@
                 <w:color w:val="17212B"/>
                 <w:sz w:val="18"/>
               </w:rPr>
-              <w:t>BLAST whole-locus scan</w:t>
+              <w:t>BLAST component scan</w:t>
             </w:r>
           </w:p>
         </w:tc>
@@ -2507,7 +2507,7 @@
                 <w:color w:val="17212B"/>
                 <w:sz w:val="18"/>
               </w:rPr>
-              <w:t>Find complete, interrupted and partial similarity to reviewed elements</w:t>
+              <w:t>Detect IRL/IRR, blaTEM, tnpR, res and tnpA independently</w:t>
             </w:r>
           </w:p>
         </w:tc>
@@ -2534,7 +2534,7 @@
                 <w:color w:val="17212B"/>
                 <w:sz w:val="18"/>
               </w:rPr>
-              <w:t>Yes</w:t>
+              <w:t>Yes; primary</w:t>
             </w:r>
           </w:p>
         </w:tc>
@@ -2563,7 +2563,7 @@
                 <w:color w:val="17212B"/>
                 <w:sz w:val="18"/>
               </w:rPr>
-              <w:t>BLAST component scan</w:t>
+              <w:t>Component assembler</w:t>
             </w:r>
           </w:p>
         </w:tc>
@@ -2590,7 +2590,7 @@
                 <w:color w:val="17212B"/>
                 <w:sz w:val="18"/>
               </w:rPr>
-              <w:t>Detect IRL/IRR, blaTEM, tnpR, res and tnpA independently</w:t>
+              <w:t>Test count, order, orientation and ends</w:t>
             </w:r>
           </w:p>
         </w:tc>
@@ -2646,7 +2646,7 @@
                 <w:color w:val="17212B"/>
                 <w:sz w:val="18"/>
               </w:rPr>
-              <w:t>Component assembler</w:t>
+              <w:t>Expert-rule classifier</w:t>
             </w:r>
           </w:p>
         </w:tc>
@@ -2673,7 +2673,7 @@
                 <w:color w:val="17212B"/>
                 <w:sz w:val="18"/>
               </w:rPr>
-              <w:t>Test count, order, orientation and ends</w:t>
+              <w:t>Assign family/type-like, fragment or unresolved result from weighted component profiles</w:t>
             </w:r>
           </w:p>
         </w:tc>
@@ -2700,7 +2700,7 @@
                 <w:color w:val="17212B"/>
                 <w:sz w:val="18"/>
               </w:rPr>
-              <w:t>Yes</w:t>
+              <w:t>Yes; primary</w:t>
             </w:r>
           </w:p>
         </w:tc>
@@ -2729,7 +2729,7 @@
                 <w:color w:val="17212B"/>
                 <w:sz w:val="18"/>
               </w:rPr>
-              <w:t>Expert-rule classifier</w:t>
+              <w:t>BLAST whole-locus comparison</w:t>
             </w:r>
           </w:p>
         </w:tc>
@@ -2756,7 +2756,7 @@
                 <w:color w:val="17212B"/>
                 <w:sz w:val="18"/>
               </w:rPr>
-              <w:t>Assign exact, type-like, fragment or unresolved result</w:t>
+              <w:t>Optionally confirm an exact reviewed definition or add closest-reference context</w:t>
             </w:r>
           </w:p>
         </w:tc>
@@ -2783,7 +2783,7 @@
                 <w:color w:val="17212B"/>
                 <w:sz w:val="18"/>
               </w:rPr>
-              <w:t>Yes</w:t>
+              <w:t>Yes; secondary</w:t>
             </w:r>
           </w:p>
         </w:tc>
@@ -2982,16 +2982,18 @@
           <w:color w:val="17212B"/>
           <w:sz w:val="16"/>
         </w:rPr>
-        <w:t># Seven reviewed whole-element definitions</w:t>
+        <w:t># Prove discovery without complete-element lookup</w:t>
+        <w:br/>
+        <w:t>matryoshka run arbitrary-demo.fasta --out results/component-only \</w:t>
+        <w:br/>
+        <w:t xml:space="preserve">  --profile tn123-components --detectors none</w:t>
+        <w:br/>
+        <w:br/>
+        <w:t># Seven reviewed definitions with secondary exact confirmation</w:t>
         <w:br/>
         <w:t>matryoshka run matryoshka/references/tn1_tn2_tn3.fasta \</w:t>
         <w:br/>
-        <w:t>+  --out results/tn123-reviewed --detectors none</w:t>
-        <w:br/>
-        <w:br/>
-        <w:t># Natural pEK499 sequence (accession EU935739.1)</w:t>
-        <w:br/>
-        <w:t>matryoshka run pEK499.fasta --out results/pEK499 --detectors none</w:t>
+        <w:t xml:space="preserve">  --out results/tn123-reviewed --detectors none</w:t>
         <w:br/>
         <w:br/>
         <w:t># Export the rules for expert review</w:t>
@@ -3368,7 +3370,7 @@
                 <w:color w:val="17212B"/>
                 <w:sz w:val="18"/>
               </w:rPr>
-              <w:t>Exact-match, closest-type, close-variant and fragment naming rules.</w:t>
+              <w:t>Weighted component-profile type rules, exact-reference confirmation and fragment rules.</w:t>
             </w:r>
           </w:p>
         </w:tc>
@@ -3752,7 +3754,7 @@
                 <w:color w:val="17212B"/>
                 <w:sz w:val="18"/>
               </w:rPr>
-              <w:t>Type assignment</w:t>
+              <w:t>Rule-based type</w:t>
             </w:r>
           </w:p>
         </w:tc>
@@ -3779,7 +3781,7 @@
                 <w:color w:val="17212B"/>
                 <w:sz w:val="18"/>
               </w:rPr>
-              <w:t>At least 95% identity and 80% reference coverage; best type must exceed the next type by at least 0.5 percentage points.</w:t>
+              <w:t>Complete grammar; weighted local component score at least 90%; best type exceeds the next by at least 0.5 points.</w:t>
             </w:r>
           </w:p>
         </w:tc>
@@ -3808,7 +3810,7 @@
                 <w:color w:val="17212B"/>
                 <w:sz w:val="18"/>
               </w:rPr>
-              <w:t>Type-like variant</w:t>
+              <w:t>Component weights</w:t>
             </w:r>
           </w:p>
         </w:tc>
@@ -3835,7 +3837,63 @@
                 <w:color w:val="17212B"/>
                 <w:sz w:val="18"/>
               </w:rPr>
-              <w:t>Complete candidate, clear closest type, at least 98% identity, but not an exact declared definition.</w:t>
+              <w:t>blaTEM 1; tnpR 2; res 3; tnpA 3. The combined profile, rather than a single gene, assigns the type-like call.</w:t>
+            </w:r>
+          </w:p>
+        </w:tc>
+      </w:tr>
+      <w:tr>
+        <w:tc>
+          <w:tcPr>
+            <w:tcW w:type="dxa" w:w="2600"/>
+            <w:tcMar>
+              <w:top w:w="80" w:type="dxa"/>
+              <w:start w:w="120" w:type="dxa"/>
+              <w:bottom w:w="80" w:type="dxa"/>
+              <w:end w:w="120" w:type="dxa"/>
+            </w:tcMar>
+            <w:vAlign w:val="center"/>
+          </w:tcPr>
+          <w:p>
+            <w:pPr>
+              <w:spacing w:after="0"/>
+            </w:pPr>
+            <w:r>
+              <w:rPr>
+                <w:rFonts w:ascii="Aptos" w:hAnsi="Aptos"/>
+                <w:b w:val="0"/>
+                <w:i w:val="0"/>
+                <w:color w:val="17212B"/>
+                <w:sz w:val="18"/>
+              </w:rPr>
+              <w:t>Secondary reference</w:t>
+            </w:r>
+          </w:p>
+        </w:tc>
+        <w:tc>
+          <w:tcPr>
+            <w:tcW w:type="dxa" w:w="5860"/>
+            <w:tcMar>
+              <w:top w:w="80" w:type="dxa"/>
+              <w:start w:w="120" w:type="dxa"/>
+              <w:bottom w:w="80" w:type="dxa"/>
+              <w:end w:w="120" w:type="dxa"/>
+            </w:tcMar>
+            <w:vAlign w:val="center"/>
+          </w:tcPr>
+          <w:p>
+            <w:pPr>
+              <w:spacing w:after="0"/>
+            </w:pPr>
+            <w:r>
+              <w:rPr>
+                <w:rFonts w:ascii="Aptos" w:hAnsi="Aptos"/>
+                <w:b w:val="0"/>
+                <w:i w:val="0"/>
+                <w:color w:val="17212B"/>
+                <w:sz w:val="18"/>
+              </w:rPr>
+              <w:t>At least 95% identity and 80% coverage; used for context or exact confirmation, never to create the family/type.</w:t>
             </w:r>
           </w:p>
         </w:tc>
@@ -3951,7 +4009,7 @@
           <w:color w:val="17212B"/>
           <w:sz w:val="22"/>
         </w:rPr>
-        <w:t>Call exact Tn1 only when the six required components are independently detected in the correct order, both 38 bp terminal ends are covered, and the whole locus is a complete, gap-free and mismatch-free match to the declared NC_008357 sequence. The canonical sequence carries blaTEM-2.</w:t>
+        <w:t>Call a Tn1-like candidate when the six required components are independently detected in the correct order and their weighted local profiles best support Tn1 above the declared score and margin. Upgrade that call to exact reviewed Tn1 only when an optional secondary comparison is a complete, gap-free and mismatch-free match to NC_008357. The canonical sequence carries blaTEM-2.</w:t>
       </w:r>
     </w:p>
     <w:p>
@@ -3974,8 +4032,33 @@
           <w:b w:val="0"/>
           <w:i w:val="0"/>
           <w:color w:val="17212B"/>
-          <w:sz w:val="15"/>
+          <w:sz w:val="14"/>
         </w:rPr>
+        <w:t>classification:</w:t>
+        <w:br/>
+        <w:t xml:space="preserve">  type_assignment:</w:t>
+        <w:br/>
+        <w:t xml:space="preserve">    method: weighted component profiles</w:t>
+        <w:br/>
+        <w:t xml:space="preserve">    discriminator_role_weights:</w:t>
+        <w:br/>
+        <w:t xml:space="preserve">      blaTEM: 1</w:t>
+        <w:br/>
+        <w:t xml:space="preserve">      tnpR: 2</w:t>
+        <w:br/>
+        <w:t xml:space="preserve">      res: 3</w:t>
+        <w:br/>
+        <w:t xml:space="preserve">      tnpA: 3</w:t>
+        <w:br/>
+        <w:t xml:space="preserve">    minimum_component_profile_score_percent: 90</w:t>
+        <w:br/>
+        <w:t xml:space="preserve">    minimum_type_margin_percent: 0.5</w:t>
+        <w:br/>
+        <w:t xml:space="preserve">  reference_comparison:</w:t>
+        <w:br/>
+        <w:t xml:space="preserve">    role: secondary context after rule-based classification</w:t>
+        <w:br/>
+        <w:br/>
         <w:t>types:</w:t>
         <w:br/>
         <w:t xml:space="preserve">  Tn1:</w:t>
@@ -3983,8 +4066,6 @@
         <w:t xml:space="preserve">    canonical_reference: Tn1_NC_008357</w:t>
         <w:br/>
         <w:t xml:space="preserve">    source_accession: NC_008357</w:t>
-        <w:br/>
-        <w:t xml:space="preserve">    bla_allele: blaTEM-2</w:t>
         <w:br/>
         <w:t xml:space="preserve">    components:</w:t>
         <w:br/>
@@ -3999,25 +4080,6 @@
         <w:t xml:space="preserve">      - {role: tnpA, name: tnpA, start: 1911, end: -34, strand: '+'}</w:t>
         <w:br/>
         <w:t xml:space="preserve">      - {role: terminal_IR, name: IRR, start: -38, end: -1}</w:t>
-        <w:br/>
-        <w:br/>
-        <w:t>definitions:</w:t>
-        <w:br/>
-        <w:t xml:space="preserve">  Tn1_NC_008357:</w:t>
-        <w:br/>
-        <w:t xml:space="preserve">    display_name: Tn1</w:t>
-        <w:br/>
-        <w:t xml:space="preserve">    type: Tn1</w:t>
-        <w:br/>
-        <w:t xml:space="preserve">    subtype: canonical</w:t>
-        <w:br/>
-        <w:t xml:space="preserve">    source_accession: NC_008357</w:t>
-        <w:br/>
-        <w:t xml:space="preserve">    component_reference: true</w:t>
-        <w:br/>
-        <w:t xml:space="preserve">    expert_rule: Exact, complete, gap-free match to NC_008357</w:t>
-        <w:br/>
-        <w:t xml:space="preserve">                 plus complete component grammar.</w:t>
       </w:r>
     </w:p>
     <w:p>
@@ -4197,7 +4259,7 @@
           <w:color w:val="5B6570"/>
           <w:sz w:val="19"/>
         </w:rPr>
-        <w:t>A five-base repeat can occur by chance. It therefore cannot create a Tn1/Tn2/Tn3 name without the component grammar and whole-locus evidence.</w:t>
+        <w:t>A five-base repeat can occur by chance. It therefore cannot create a Tn1/Tn2/Tn3 name without the complete component grammar and type-profile evidence.</w:t>
       </w:r>
     </w:p>
     <w:p>
@@ -4667,6 +4729,89 @@
                 <w:color w:val="17212B"/>
                 <w:sz w:val="17"/>
               </w:rPr>
+              <w:t>Internal deletion</w:t>
+            </w:r>
+          </w:p>
+        </w:tc>
+        <w:tc>
+          <w:tcPr>
+            <w:tcW w:type="dxa" w:w="2700"/>
+            <w:tcMar>
+              <w:top w:w="80" w:type="dxa"/>
+              <w:start w:w="120" w:type="dxa"/>
+              <w:bottom w:w="80" w:type="dxa"/>
+              <w:end w:w="120" w:type="dxa"/>
+            </w:tcMar>
+            <w:vAlign w:val="center"/>
+          </w:tcPr>
+          <w:p>
+            <w:pPr>
+              <w:spacing w:after="0"/>
+            </w:pPr>
+            <w:r>
+              <w:rPr>
+                <w:rFonts w:ascii="Aptos" w:hAnsi="Aptos"/>
+                <w:b w:val="0"/>
+                <w:i w:val="0"/>
+                <w:color w:val="17212B"/>
+                <w:sz w:val="17"/>
+              </w:rPr>
+              <w:t>Tn2 with a 300 bp deletion</w:t>
+            </w:r>
+          </w:p>
+        </w:tc>
+        <w:tc>
+          <w:tcPr>
+            <w:tcW w:type="dxa" w:w="3360"/>
+            <w:tcMar>
+              <w:top w:w="80" w:type="dxa"/>
+              <w:start w:w="120" w:type="dxa"/>
+              <w:bottom w:w="80" w:type="dxa"/>
+              <w:end w:w="120" w:type="dxa"/>
+            </w:tcMar>
+            <w:vAlign w:val="center"/>
+          </w:tcPr>
+          <w:p>
+            <w:pPr>
+              <w:spacing w:after="0"/>
+            </w:pPr>
+            <w:r>
+              <w:rPr>
+                <w:rFonts w:ascii="Aptos" w:hAnsi="Aptos"/>
+                <w:b w:val="0"/>
+                <w:i w:val="0"/>
+                <w:color w:val="17212B"/>
+                <w:sz w:val="17"/>
+              </w:rPr>
+              <w:t>Verify split component evidence is chained and remains Tn2-like.</w:t>
+            </w:r>
+          </w:p>
+        </w:tc>
+      </w:tr>
+      <w:tr>
+        <w:tc>
+          <w:tcPr>
+            <w:tcW w:type="dxa" w:w="2400"/>
+            <w:tcMar>
+              <w:top w:w="80" w:type="dxa"/>
+              <w:start w:w="120" w:type="dxa"/>
+              <w:bottom w:w="80" w:type="dxa"/>
+              <w:end w:w="120" w:type="dxa"/>
+            </w:tcMar>
+            <w:vAlign w:val="center"/>
+          </w:tcPr>
+          <w:p>
+            <w:pPr>
+              <w:spacing w:after="0"/>
+            </w:pPr>
+            <w:r>
+              <w:rPr>
+                <w:rFonts w:ascii="Aptos" w:hAnsi="Aptos"/>
+                <w:b w:val="0"/>
+                <w:i w:val="0"/>
+                <w:color w:val="17212B"/>
+                <w:sz w:val="17"/>
+              </w:rPr>
               <w:t>Truncation</w:t>
             </w:r>
           </w:p>
@@ -4836,7 +4981,7 @@
           <w:color w:val="17633A"/>
           <w:sz w:val="22"/>
         </w:rPr>
-        <w:t>All 14 ledger checks pass. The seven reviewed whole-element inputs produce seven exact declared calls with complete independently detected component grammars. The two pEK499 loci remain partial. The synthetic variants retain their differences, and the three related elements are not misnamed as Tn1, Tn2 or Tn3.</w:t>
+        <w:t>All 14 real-accession ledger checks and all 23 focused Tn1/Tn2/Tn3 acceptance tests pass. The component-only tests type substituted, inserted and deleted variants without a complete-element lookup. The reviewed inputs receive exact confirmation; the pEK499 loci remain partial; related elements are not misnamed.</w:t>
       </w:r>
     </w:p>
     <w:p>
@@ -7853,7 +7998,7 @@
       <w:r>
         <w:drawing>
           <wp:inline xmlns:a="http://schemas.openxmlformats.org/drawingml/2006/main" xmlns:pic="http://schemas.openxmlformats.org/drawingml/2006/picture">
-            <wp:extent cx="8458200" cy="2421160"/>
+            <wp:extent cx="8458200" cy="2512790"/>
             <wp:docPr id="2" name="Picture 2" title="Tn1 MARA table" descr="MARA-style feature table for accession NC_008357."/>
             <wp:cNvGraphicFramePr>
               <a:graphicFrameLocks noChangeAspect="1"/>
@@ -7874,7 +8019,7 @@
                   <pic:spPr>
                     <a:xfrm>
                       <a:off x="0" y="0"/>
-                      <a:ext cx="8458200" cy="2421160"/>
+                      <a:ext cx="8458200" cy="2512790"/>
                     </a:xfrm>
                     <a:prstGeom prst="rect"/>
                   </pic:spPr>
@@ -9345,7 +9490,7 @@
           <w:color w:val="5B6570"/>
           <w:sz w:val="17"/>
         </w:rPr>
-        <w:t>Definition: Tn1_NC_008357 (version 2026-08-27). Variant status: exact_reference. Reference-projected required components: 0. Context features from the reviewed definition: 0.</w:t>
+        <w:t>Definition: Tn1_NC_008357 (version 2026-08-27). Variant status: exact_reference_confirmed. Reference-projected required components: 0. Context features from the reviewed definition: 0.</w:t>
       </w:r>
     </w:p>
     <w:p>
@@ -9825,7 +9970,7 @@
       <w:r>
         <w:drawing>
           <wp:inline xmlns:a="http://schemas.openxmlformats.org/drawingml/2006/main" xmlns:pic="http://schemas.openxmlformats.org/drawingml/2006/picture">
-            <wp:extent cx="8458200" cy="2421160"/>
+            <wp:extent cx="8458200" cy="2512790"/>
             <wp:docPr id="5" name="Picture 5" title="Tn2 MARA table" descr="MARA-style feature table for accession AY123253."/>
             <wp:cNvGraphicFramePr>
               <a:graphicFrameLocks noChangeAspect="1"/>
@@ -9846,7 +9991,7 @@
                   <pic:spPr>
                     <a:xfrm>
                       <a:off x="0" y="0"/>
-                      <a:ext cx="8458200" cy="2421160"/>
+                      <a:ext cx="8458200" cy="2512790"/>
                     </a:xfrm>
                     <a:prstGeom prst="rect"/>
                   </pic:spPr>
@@ -11317,7 +11462,7 @@
           <w:color w:val="5B6570"/>
           <w:sz w:val="17"/>
         </w:rPr>
-        <w:t>Definition: Tn2_AY123253 (version 2026-08-27). Variant status: exact_reference. Reference-projected required components: 0. Context features from the reviewed definition: 0.</w:t>
+        <w:t>Definition: Tn2_AY123253 (version 2026-08-27). Variant status: exact_reference_confirmed. Reference-projected required components: 0. Context features from the reviewed definition: 0.</w:t>
       </w:r>
     </w:p>
     <w:p>
@@ -11797,7 +11942,7 @@
       <w:r>
         <w:drawing>
           <wp:inline xmlns:a="http://schemas.openxmlformats.org/drawingml/2006/main" xmlns:pic="http://schemas.openxmlformats.org/drawingml/2006/picture">
-            <wp:extent cx="8458200" cy="2421160"/>
+            <wp:extent cx="8458200" cy="2512790"/>
             <wp:docPr id="8" name="Picture 8" title="Tn3 MARA table" descr="MARA-style feature table for accession HM749966."/>
             <wp:cNvGraphicFramePr>
               <a:graphicFrameLocks noChangeAspect="1"/>
@@ -11818,7 +11963,7 @@
                   <pic:spPr>
                     <a:xfrm>
                       <a:off x="0" y="0"/>
-                      <a:ext cx="8458200" cy="2421160"/>
+                      <a:ext cx="8458200" cy="2512790"/>
                     </a:xfrm>
                     <a:prstGeom prst="rect"/>
                   </pic:spPr>
@@ -13289,7 +13434,7 @@
           <w:color w:val="5B6570"/>
           <w:sz w:val="17"/>
         </w:rPr>
-        <w:t>Definition: Tn3_HM749966 (version 2026-08-27). Variant status: exact_reference. Reference-projected required components: 0. Context features from the reviewed definition: 0.</w:t>
+        <w:t>Definition: Tn3_HM749966 (version 2026-08-27). Variant status: exact_reference_confirmed. Reference-projected required components: 0. Context features from the reviewed definition: 0.</w:t>
       </w:r>
     </w:p>
     <w:p>
@@ -13769,7 +13914,7 @@
       <w:r>
         <w:drawing>
           <wp:inline xmlns:a="http://schemas.openxmlformats.org/drawingml/2006/main" xmlns:pic="http://schemas.openxmlformats.org/drawingml/2006/picture">
-            <wp:extent cx="8458200" cy="2604421"/>
+            <wp:extent cx="8458200" cy="2696051"/>
             <wp:docPr id="11" name="Picture 11" title="Tn2c MARA table" descr="MARA-style feature table for accession HM749967."/>
             <wp:cNvGraphicFramePr>
               <a:graphicFrameLocks noChangeAspect="1"/>
@@ -13790,7 +13935,7 @@
                   <pic:spPr>
                     <a:xfrm>
                       <a:off x="0" y="0"/>
-                      <a:ext cx="8458200" cy="2604421"/>
+                      <a:ext cx="8458200" cy="2696051"/>
                     </a:xfrm>
                     <a:prstGeom prst="rect"/>
                   </pic:spPr>
@@ -15261,7 +15406,7 @@
           <w:color w:val="5B6570"/>
           <w:sz w:val="17"/>
         </w:rPr>
-        <w:t>Definition: Tn2c_HM749967 (version 2026-08-27). Variant status: exact_reference. Reference-projected required components: 0. Context features from the reviewed definition: 0.</w:t>
+        <w:t>Definition: Tn2c_HM749967 (version 2026-08-27). Variant status: exact_reference_confirmed. Reference-projected required components: 0. Context features from the reviewed definition: 0.</w:t>
       </w:r>
     </w:p>
     <w:p>
@@ -17253,7 +17398,7 @@
           <w:color w:val="5B6570"/>
           <w:sz w:val="17"/>
         </w:rPr>
-        <w:t>Definition: Tn2_1_CP028717 (version 2026-08-27). Variant status: exact_reference. Reference-projected required components: 0. Context features from the reviewed definition: 2.</w:t>
+        <w:t>Definition: Tn2_1_CP028717 (version 2026-08-27). Variant status: exact_reference_confirmed. Reference-projected required components: 0. Context features from the reviewed definition: 2.</w:t>
       </w:r>
     </w:p>
     <w:p>
@@ -19341,7 +19486,7 @@
           <w:color w:val="5B6570"/>
           <w:sz w:val="17"/>
         </w:rPr>
-        <w:t>Definition: Tn1Mer_GQ160960 (version 2026-08-27). Variant status: exact_reference. Reference-projected required components: 0. Context features from the reviewed definition: 1.</w:t>
+        <w:t>Definition: Tn1Mer_GQ160960 (version 2026-08-27). Variant status: exact_reference_confirmed. Reference-projected required components: 0. Context features from the reviewed definition: 1.</w:t>
       </w:r>
     </w:p>
     <w:p>
@@ -19821,7 +19966,7 @@
       <w:r>
         <w:drawing>
           <wp:inline xmlns:a="http://schemas.openxmlformats.org/drawingml/2006/main" xmlns:pic="http://schemas.openxmlformats.org/drawingml/2006/picture">
-            <wp:extent cx="8458200" cy="2685479"/>
+            <wp:extent cx="8458200" cy="2777109"/>
             <wp:docPr id="22" name="Picture 22" title="Tn3 MARA table" descr="MARA-style feature table for accession V00613."/>
             <wp:cNvGraphicFramePr>
               <a:graphicFrameLocks noChangeAspect="1"/>
@@ -19842,7 +19987,7 @@
                   <pic:spPr>
                     <a:xfrm>
                       <a:off x="0" y="0"/>
-                      <a:ext cx="8458200" cy="2685479"/>
+                      <a:ext cx="8458200" cy="2777109"/>
                     </a:xfrm>
                     <a:prstGeom prst="rect"/>
                   </pic:spPr>
@@ -21313,7 +21458,7 @@
           <w:color w:val="5B6570"/>
           <w:sz w:val="17"/>
         </w:rPr>
-        <w:t>Definition: Tn3_V00613 (version 2026-08-27). Variant status: exact_reference. Reference-projected required components: 0. Context features from the reviewed definition: 0.</w:t>
+        <w:t>Definition: Tn3_V00613 (version 2026-08-27). Variant status: exact_reference_confirmed. Reference-projected required components: 0. Context features from the reviewed definition: 0.</w:t>
       </w:r>
     </w:p>
     <w:p>
@@ -22261,7 +22406,7 @@
           <w:color w:val="17212B"/>
           <w:sz w:val="21"/>
         </w:rPr>
-        <w:t>A single 44,647 bp contig was constructed with unrelated flanking sequence and three loci: a Tn1 with 25 substitutions, a Tn2 with an approximately 800 bp internal insertion (799 inserted bases in the alignment evidence), and an unchanged reverse-complement Tn3. The FASTA was processed as one ordinary record.</w:t>
+        <w:t>A single 44,647 bp contig was constructed with unrelated flanking sequence and three loci: a Tn1-derived sequence with 25 substitutions, a Tn2-derived sequence with an approximately 800 bp internal insertion, and a reverse-complement Tn3-derived sequence. It was processed with --profile tn123-components, which excludes complete Tn1/Tn2/Tn3 reference lookup. Every biological call below therefore comes from detected components and expert rules.</w:t>
       </w:r>
     </w:p>
     <w:tbl>
@@ -22394,7 +22539,7 @@
                 <w:color w:val="17365D"/>
                 <w:sz w:val="17"/>
               </w:rPr>
-              <w:t>Identity</w:t>
+              <w:t>Rule type</w:t>
             </w:r>
           </w:p>
         </w:tc>
@@ -22422,7 +22567,7 @@
                 <w:color w:val="17365D"/>
                 <w:sz w:val="17"/>
               </w:rPr>
-              <w:t>Mismatches</w:t>
+              <w:t>Component score</w:t>
             </w:r>
           </w:p>
         </w:tc>
@@ -22450,7 +22595,7 @@
                 <w:color w:val="17365D"/>
                 <w:sz w:val="17"/>
               </w:rPr>
-              <w:t>Inserted bp</w:t>
+              <w:t>Whole-element lookup</w:t>
             </w:r>
           </w:p>
         </w:tc>
@@ -22588,7 +22733,7 @@
                 <w:color w:val="17212B"/>
                 <w:sz w:val="17"/>
               </w:rPr>
-              <w:t>99.5%</w:t>
+              <w:t>Tn1</w:t>
             </w:r>
           </w:p>
         </w:tc>
@@ -22615,7 +22760,7 @@
                 <w:color w:val="17212B"/>
                 <w:sz w:val="17"/>
               </w:rPr>
-              <w:t>25</w:t>
+              <w:t>99.592</w:t>
             </w:r>
           </w:p>
         </w:tc>
@@ -22642,7 +22787,7 @@
                 <w:color w:val="17212B"/>
                 <w:sz w:val="17"/>
               </w:rPr>
-              <w:t>0</w:t>
+              <w:t>none</w:t>
             </w:r>
           </w:p>
         </w:tc>
@@ -22780,7 +22925,7 @@
                 <w:color w:val="17212B"/>
                 <w:sz w:val="17"/>
               </w:rPr>
-              <w:t>100.0%</w:t>
+              <w:t>Tn2</w:t>
             </w:r>
           </w:p>
         </w:tc>
@@ -22807,7 +22952,7 @@
                 <w:color w:val="17212B"/>
                 <w:sz w:val="17"/>
               </w:rPr>
-              <w:t>0</w:t>
+              <w:t>100.0</w:t>
             </w:r>
           </w:p>
         </w:tc>
@@ -22834,7 +22979,7 @@
                 <w:color w:val="17212B"/>
                 <w:sz w:val="17"/>
               </w:rPr>
-              <w:t>799</w:t>
+              <w:t>none</w:t>
             </w:r>
           </w:p>
         </w:tc>
@@ -22918,13 +23063,67 @@
                 <w:color w:val="17212B"/>
                 <w:sz w:val="17"/>
               </w:rPr>
+              <w:t>Tn3-like</w:t>
+            </w:r>
+          </w:p>
+        </w:tc>
+        <w:tc>
+          <w:tcPr>
+            <w:tcW w:type="dxa" w:w="800"/>
+            <w:tcMar>
+              <w:top w:w="80" w:type="dxa"/>
+              <w:start w:w="120" w:type="dxa"/>
+              <w:bottom w:w="80" w:type="dxa"/>
+              <w:end w:w="120" w:type="dxa"/>
+            </w:tcMar>
+            <w:vAlign w:val="center"/>
+          </w:tcPr>
+          <w:p>
+            <w:pPr>
+              <w:spacing w:after="0"/>
+            </w:pPr>
+            <w:r>
+              <w:rPr>
+                <w:rFonts w:ascii="Aptos" w:hAnsi="Aptos"/>
+                <w:b w:val="0"/>
+                <w:i w:val="0"/>
+                <w:color w:val="17212B"/>
+                <w:sz w:val="17"/>
+              </w:rPr>
+              <w:t>-</w:t>
+            </w:r>
+          </w:p>
+        </w:tc>
+        <w:tc>
+          <w:tcPr>
+            <w:tcW w:type="dxa" w:w="1200"/>
+            <w:tcMar>
+              <w:top w:w="80" w:type="dxa"/>
+              <w:start w:w="120" w:type="dxa"/>
+              <w:bottom w:w="80" w:type="dxa"/>
+              <w:end w:w="120" w:type="dxa"/>
+            </w:tcMar>
+            <w:vAlign w:val="center"/>
+          </w:tcPr>
+          <w:p>
+            <w:pPr>
+              <w:spacing w:after="0"/>
+            </w:pPr>
+            <w:r>
+              <w:rPr>
+                <w:rFonts w:ascii="Aptos" w:hAnsi="Aptos"/>
+                <w:b w:val="0"/>
+                <w:i w:val="0"/>
+                <w:color w:val="17212B"/>
+                <w:sz w:val="17"/>
+              </w:rPr>
               <w:t>Tn3</w:t>
             </w:r>
           </w:p>
         </w:tc>
         <w:tc>
           <w:tcPr>
-            <w:tcW w:type="dxa" w:w="800"/>
+            <w:tcW w:type="dxa" w:w="1300"/>
             <w:tcMar>
               <w:top w:w="80" w:type="dxa"/>
               <w:start w:w="120" w:type="dxa"/>
@@ -22945,13 +23144,13 @@
                 <w:color w:val="17212B"/>
                 <w:sz w:val="17"/>
               </w:rPr>
-              <w:t>-</w:t>
-            </w:r>
-          </w:p>
-        </w:tc>
-        <w:tc>
-          <w:tcPr>
-            <w:tcW w:type="dxa" w:w="1200"/>
+              <w:t>100.0</w:t>
+            </w:r>
+          </w:p>
+        </w:tc>
+        <w:tc>
+          <w:tcPr>
+            <w:tcW w:type="dxa" w:w="1300"/>
             <w:tcMar>
               <w:top w:w="80" w:type="dxa"/>
               <w:start w:w="120" w:type="dxa"/>
@@ -22972,61 +23171,7 @@
                 <w:color w:val="17212B"/>
                 <w:sz w:val="17"/>
               </w:rPr>
-              <w:t>100.0%</w:t>
-            </w:r>
-          </w:p>
-        </w:tc>
-        <w:tc>
-          <w:tcPr>
-            <w:tcW w:type="dxa" w:w="1300"/>
-            <w:tcMar>
-              <w:top w:w="80" w:type="dxa"/>
-              <w:start w:w="120" w:type="dxa"/>
-              <w:bottom w:w="80" w:type="dxa"/>
-              <w:end w:w="120" w:type="dxa"/>
-            </w:tcMar>
-            <w:vAlign w:val="center"/>
-          </w:tcPr>
-          <w:p>
-            <w:pPr>
-              <w:spacing w:after="0"/>
-            </w:pPr>
-            <w:r>
-              <w:rPr>
-                <w:rFonts w:ascii="Aptos" w:hAnsi="Aptos"/>
-                <w:b w:val="0"/>
-                <w:i w:val="0"/>
-                <w:color w:val="17212B"/>
-                <w:sz w:val="17"/>
-              </w:rPr>
-              <w:t>0</w:t>
-            </w:r>
-          </w:p>
-        </w:tc>
-        <w:tc>
-          <w:tcPr>
-            <w:tcW w:type="dxa" w:w="1300"/>
-            <w:tcMar>
-              <w:top w:w="80" w:type="dxa"/>
-              <w:start w:w="120" w:type="dxa"/>
-              <w:bottom w:w="80" w:type="dxa"/>
-              <w:end w:w="120" w:type="dxa"/>
-            </w:tcMar>
-            <w:vAlign w:val="center"/>
-          </w:tcPr>
-          <w:p>
-            <w:pPr>
-              <w:spacing w:after="0"/>
-            </w:pPr>
-            <w:r>
-              <w:rPr>
-                <w:rFonts w:ascii="Aptos" w:hAnsi="Aptos"/>
-                <w:b w:val="0"/>
-                <w:i w:val="0"/>
-                <w:color w:val="17212B"/>
-                <w:sz w:val="17"/>
-              </w:rPr>
-              <w:t>0</w:t>
+              <w:t>none</w:t>
             </w:r>
           </w:p>
         </w:tc>
@@ -23154,7 +23299,7 @@
           <w:color w:val="17212B"/>
           <w:sz w:val="21"/>
         </w:rPr>
-        <w:t>The component grammar is complete. The whole-locus comparison gives 99.5% identity and 100.0% coverage, with 25 mismatches and 0 inserted bases. The visible call is therefore Tn1-like.</w:t>
+        <w:t>The component grammar is complete and the expert component-profile rules assign Tn1. No complete Tn1/Tn2/Tn3 reference comparison was run; the visible call is Tn1-like. Insertions and other structural differences are retained from split component alignments and shown in the map/table.</w:t>
       </w:r>
     </w:p>
     <w:p>
@@ -23205,7 +23350,7 @@
       <w:r>
         <w:drawing>
           <wp:inline xmlns:a="http://schemas.openxmlformats.org/drawingml/2006/main" xmlns:pic="http://schemas.openxmlformats.org/drawingml/2006/picture">
-            <wp:extent cx="8458200" cy="2512790"/>
+            <wp:extent cx="8458200" cy="2421160"/>
             <wp:docPr id="31" name="Picture 31" title="Arbitrary contig Tn1-like MARA table" descr="MARA-style evidence table for the detected Tn1-like locus."/>
             <wp:cNvGraphicFramePr>
               <a:graphicFrameLocks noChangeAspect="1"/>
@@ -23226,7 +23371,7 @@
                   <pic:spPr>
                     <a:xfrm>
                       <a:off x="0" y="0"/>
-                      <a:ext cx="8458200" cy="2512790"/>
+                      <a:ext cx="8458200" cy="2421160"/>
                     </a:xfrm>
                     <a:prstGeom prst="rect"/>
                   </pic:spPr>
@@ -23270,7 +23415,7 @@
           <w:color w:val="17212B"/>
           <w:sz w:val="21"/>
         </w:rPr>
-        <w:t>The component grammar is complete. The whole-locus comparison gives 100.0% identity and 100.0% coverage, with 0 mismatches and 799 inserted bases. The visible call is therefore Tn2-like.</w:t>
+        <w:t>The component grammar is complete and the expert component-profile rules assign Tn2. No complete Tn1/Tn2/Tn3 reference comparison was run; the visible call is Tn2-like. Insertions and other structural differences are retained from split component alignments and shown in the map/table.</w:t>
       </w:r>
     </w:p>
     <w:p>
@@ -23281,7 +23426,7 @@
       <w:r>
         <w:drawing>
           <wp:inline xmlns:a="http://schemas.openxmlformats.org/drawingml/2006/main" xmlns:pic="http://schemas.openxmlformats.org/drawingml/2006/picture">
-            <wp:extent cx="8458200" cy="2008823"/>
+            <wp:extent cx="7909560" cy="1878520"/>
             <wp:docPr id="32" name="Picture 32" title="Arbitrary contig Tn2-like MARA map" descr="MARA-style map of the detected Tn2-like locus on the arbitrary contig."/>
             <wp:cNvGraphicFramePr>
               <a:graphicFrameLocks noChangeAspect="1"/>
@@ -23302,7 +23447,7 @@
                   <pic:spPr>
                     <a:xfrm>
                       <a:off x="0" y="0"/>
-                      <a:ext cx="8458200" cy="2008823"/>
+                      <a:ext cx="7909560" cy="1878520"/>
                     </a:xfrm>
                     <a:prstGeom prst="rect"/>
                   </pic:spPr>
@@ -23321,7 +23466,7 @@
       <w:r>
         <w:drawing>
           <wp:inline xmlns:a="http://schemas.openxmlformats.org/drawingml/2006/main" xmlns:pic="http://schemas.openxmlformats.org/drawingml/2006/picture">
-            <wp:extent cx="8458200" cy="2777109"/>
+            <wp:extent cx="7909560" cy="2511285"/>
             <wp:docPr id="33" name="Picture 33" title="Arbitrary contig Tn2-like MARA table" descr="MARA-style evidence table for the detected Tn2-like locus."/>
             <wp:cNvGraphicFramePr>
               <a:graphicFrameLocks noChangeAspect="1"/>
@@ -23342,7 +23487,7 @@
                   <pic:spPr>
                     <a:xfrm>
                       <a:off x="0" y="0"/>
-                      <a:ext cx="8458200" cy="2777109"/>
+                      <a:ext cx="7909560" cy="2511285"/>
                     </a:xfrm>
                     <a:prstGeom prst="rect"/>
                   </pic:spPr>
@@ -23370,7 +23515,7 @@
         <w:pStyle w:val="Heading1"/>
       </w:pPr>
       <w:r>
-        <w:t>8.3 Arbitrary contig locus — Tn3</w:t>
+        <w:t>8.3 Arbitrary contig locus — Tn3-like</w:t>
       </w:r>
     </w:p>
     <w:p>
@@ -23386,7 +23531,7 @@
           <w:color w:val="17212B"/>
           <w:sz w:val="21"/>
         </w:rPr>
-        <w:t>The component grammar is complete. The whole-locus comparison gives 100.0% identity and 100.0% coverage, with 0 mismatches and 0 inserted bases. The visible call is therefore Tn3.</w:t>
+        <w:t>The component grammar is complete and the expert component-profile rules assign Tn3. No complete Tn1/Tn2/Tn3 reference comparison was run; the visible call is Tn3-like. Insertions and other structural differences are retained from split component alignments and shown in the map/table.</w:t>
       </w:r>
     </w:p>
     <w:p>
@@ -23398,7 +23543,7 @@
         <w:drawing>
           <wp:inline xmlns:a="http://schemas.openxmlformats.org/drawingml/2006/main" xmlns:pic="http://schemas.openxmlformats.org/drawingml/2006/picture">
             <wp:extent cx="8458200" cy="2008823"/>
-            <wp:docPr id="34" name="Picture 34" title="Arbitrary contig Tn3 MARA map" descr="MARA-style map of the detected Tn3 locus on the arbitrary contig."/>
+            <wp:docPr id="34" name="Picture 34" title="Arbitrary contig Tn3-like MARA map" descr="MARA-style map of the detected Tn3-like locus on the arbitrary contig."/>
             <wp:cNvGraphicFramePr>
               <a:graphicFrameLocks noChangeAspect="1"/>
             </wp:cNvGraphicFramePr>
@@ -23406,7 +23551,7 @@
               <a:graphicData uri="http://schemas.openxmlformats.org/drawingml/2006/picture">
                 <pic:pic>
                   <pic:nvPicPr>
-                    <pic:cNvPr id="0" name="mara-arbitrary_demo_contig__Tn3__31700-36647.png"/>
+                    <pic:cNvPr id="0" name="mara-arbitrary_demo_contig__Tn3-like__31700-36647.png"/>
                     <pic:cNvPicPr/>
                   </pic:nvPicPr>
                   <pic:blipFill>
@@ -23438,7 +23583,7 @@
         <w:drawing>
           <wp:inline xmlns:a="http://schemas.openxmlformats.org/drawingml/2006/main" xmlns:pic="http://schemas.openxmlformats.org/drawingml/2006/picture">
             <wp:extent cx="8458200" cy="2421160"/>
-            <wp:docPr id="35" name="Picture 35" title="Arbitrary contig Tn3 MARA table" descr="MARA-style evidence table for the detected Tn3 locus."/>
+            <wp:docPr id="35" name="Picture 35" title="Arbitrary contig Tn3-like MARA table" descr="MARA-style evidence table for the detected Tn3-like locus."/>
             <wp:cNvGraphicFramePr>
               <a:graphicFrameLocks noChangeAspect="1"/>
             </wp:cNvGraphicFramePr>
@@ -23446,7 +23591,7 @@
               <a:graphicData uri="http://schemas.openxmlformats.org/drawingml/2006/picture">
                 <pic:pic>
                   <pic:nvPicPr>
-                    <pic:cNvPr id="0" name="mara-table-arbitrary_demo_contig__Tn3__31700-36647.png"/>
+                    <pic:cNvPr id="0" name="mara-table-arbitrary_demo_contig__Tn3-like__31700-36647.png"/>
                     <pic:cNvPicPr/>
                   </pic:nvPicPr>
                   <pic:blipFill>
@@ -24303,7 +24448,7 @@
           <w:color w:val="17212B"/>
           <w:sz w:val="20"/>
         </w:rPr>
-        <w:t>Reliable de novo naming of a previously undescribed element without expert review and a declared definition.</w:t>
+        <w:t>Assigning a new formal element name to a previously undescribed structure without expert review; novel candidates within the defined family are deliberately reported as type-like.</w:t>
       </w:r>
     </w:p>
     <w:p>

</xml_diff>

<commit_message>
Standardise locus map and table terminology
</commit_message>
<xml_diff>
--- a/reports/Matryoshka-Tn123-definition-and-validation-report.docx
+++ b/reports/Matryoshka-Tn123-definition-and-validation-report.docx
@@ -44,9 +44,9 @@
           <w:color w:val="5B6570"/>
           <w:sz w:val="26"/>
         </w:rPr>
-        <w:t>Expert rules, real-accession validation, MARA-style locus maps,</w:t>
+        <w:t>Expert rules, real-accession validation, locus maps,</w:t>
         <w:br/>
-        <w:t>MARA tables and hierarchical outputs</w:t>
+        <w:t>locus tables and hierarchical outputs</w:t>
       </w:r>
     </w:p>
     <w:tbl>
@@ -358,7 +358,7 @@
           <w:color w:val="17212B"/>
           <w:sz w:val="22"/>
         </w:rPr>
-        <w:t>The validated scope is Tn1, Tn2, Tn3 and the reviewed close definitions listed here. It is not yet an exhaustive replacement for expert MARA annotation across every mobile-element family.</w:t>
+        <w:t>The validated scope is Tn1, Tn2, Tn3 and the reviewed close definitions listed here. It is not yet an exhaustive replacement for expert mobile-element annotation across every family.</w:t>
       </w:r>
     </w:p>
     <w:p>
@@ -977,7 +977,7 @@
                 <w:color w:val="17212B"/>
                 <w:sz w:val="18"/>
               </w:rPr>
-              <w:t>MARA map, MARA table, hierarchy and component ledger for every reviewed definition</w:t>
+              <w:t>locus map, locus table, hierarchy and component ledger for every reviewed definition</w:t>
             </w:r>
           </w:p>
         </w:tc>
@@ -1223,7 +1223,7 @@
           <w:color w:val="17212B"/>
           <w:sz w:val="20"/>
         </w:rPr>
-        <w:t>Every result can be inspected as a MARA-style map, a MARA table, the original hierarchy view, JSON, GFF3 and CellGen format.</w:t>
+        <w:t>Every result can be inspected as a locus map, a locus table, the original hierarchy view, JSON, GFF3 and CellGen format.</w:t>
       </w:r>
     </w:p>
     <w:p>
@@ -1906,7 +1906,7 @@
                 <w:color w:val="17212B"/>
                 <w:sz w:val="18"/>
               </w:rPr>
-              <w:t>JSON, GFF3, CellGen, hierarchy SVG, MARA map, MARA table and proof ledger.</w:t>
+              <w:t>JSON, GFF3, CellGen, hierarchy SVG, locus map, locus table and proof ledger.</w:t>
             </w:r>
           </w:p>
         </w:tc>
@@ -3030,7 +3030,7 @@
           <w:color w:val="17212B"/>
           <w:sz w:val="21"/>
         </w:rPr>
-        <w:t>Each result directory includes run.json, the software and definition versions, reference profile, detector selection, input checksum, runtime parameters and a direct index of every MARA map/table pair.</w:t>
+        <w:t>Each result directory includes run.json, the software and definition versions, reference profile, detector selection, input checksum, runtime parameters and a direct index of every locus map/table pair.</w:t>
       </w:r>
     </w:p>
     <w:p>
@@ -7931,7 +7931,7 @@
           <w:color w:val="5B6570"/>
           <w:sz w:val="17"/>
         </w:rPr>
-        <w:t>MARA-style locus map generated from the detected and assembled features for Tn1_NC_008357.</w:t>
+        <w:t>locus map generated from the detected and assembled features for Tn1_NC_008357.</w:t>
       </w:r>
     </w:p>
     <w:p>
@@ -7943,7 +7943,7 @@
         <w:drawing>
           <wp:inline xmlns:a="http://schemas.openxmlformats.org/drawingml/2006/main" xmlns:pic="http://schemas.openxmlformats.org/drawingml/2006/picture">
             <wp:extent cx="8458200" cy="2008823"/>
-            <wp:docPr id="1" name="Picture 1" title="Tn1 MARA locus map" descr="MARA-style locus map for accession NC_008357 with detected components and legend."/>
+            <wp:docPr id="1" name="Picture 1" title="Tn1 locus maps" descr="locus map for accession NC_008357 with detected components and legend."/>
             <wp:cNvGraphicFramePr>
               <a:graphicFrameLocks noChangeAspect="1"/>
             </wp:cNvGraphicFramePr>
@@ -7951,7 +7951,7 @@
               <a:graphicData uri="http://schemas.openxmlformats.org/drawingml/2006/picture">
                 <pic:pic>
                   <pic:nvPicPr>
-                    <pic:cNvPr id="0" name="mara-Tn1_NC_008357__Tn1__1-4949.png"/>
+                    <pic:cNvPr id="0" name="locus-map-Tn1_NC_008357__Tn1__1-4949.png"/>
                     <pic:cNvPicPr/>
                   </pic:nvPicPr>
                   <pic:blipFill>
@@ -7987,7 +7987,7 @@
           <w:color w:val="5B6570"/>
           <w:sz w:val="17"/>
         </w:rPr>
-        <w:t>MARA table generated from the same call and evidence ledger.</w:t>
+        <w:t>locus table generated from the same call and evidence ledger.</w:t>
       </w:r>
     </w:p>
     <w:p>
@@ -7999,7 +7999,7 @@
         <w:drawing>
           <wp:inline xmlns:a="http://schemas.openxmlformats.org/drawingml/2006/main" xmlns:pic="http://schemas.openxmlformats.org/drawingml/2006/picture">
             <wp:extent cx="8458200" cy="2512790"/>
-            <wp:docPr id="2" name="Picture 2" title="Tn1 MARA table" descr="MARA-style feature table for accession NC_008357."/>
+            <wp:docPr id="2" name="Picture 2" title="Tn1 locus table" descr="locus feature table for accession NC_008357."/>
             <wp:cNvGraphicFramePr>
               <a:graphicFrameLocks noChangeAspect="1"/>
             </wp:cNvGraphicFramePr>
@@ -8007,7 +8007,7 @@
               <a:graphicData uri="http://schemas.openxmlformats.org/drawingml/2006/picture">
                 <pic:pic>
                   <pic:nvPicPr>
-                    <pic:cNvPr id="0" name="mara-table-Tn1_NC_008357__Tn1__1-4949.png"/>
+                    <pic:cNvPr id="0" name="locus-table-Tn1_NC_008357__Tn1__1-4949.png"/>
                     <pic:cNvPicPr/>
                   </pic:nvPicPr>
                   <pic:blipFill>
@@ -9903,7 +9903,7 @@
           <w:color w:val="5B6570"/>
           <w:sz w:val="17"/>
         </w:rPr>
-        <w:t>MARA-style locus map generated from the detected and assembled features for Tn2_AY123253.</w:t>
+        <w:t>locus map generated from the detected and assembled features for Tn2_AY123253.</w:t>
       </w:r>
     </w:p>
     <w:p>
@@ -9915,7 +9915,7 @@
         <w:drawing>
           <wp:inline xmlns:a="http://schemas.openxmlformats.org/drawingml/2006/main" xmlns:pic="http://schemas.openxmlformats.org/drawingml/2006/picture">
             <wp:extent cx="8458200" cy="2008823"/>
-            <wp:docPr id="4" name="Picture 4" title="Tn2 MARA locus map" descr="MARA-style locus map for accession AY123253 with detected components and legend."/>
+            <wp:docPr id="4" name="Picture 4" title="Tn2 locus maps" descr="locus map for accession AY123253 with detected components and legend."/>
             <wp:cNvGraphicFramePr>
               <a:graphicFrameLocks noChangeAspect="1"/>
             </wp:cNvGraphicFramePr>
@@ -9923,7 +9923,7 @@
               <a:graphicData uri="http://schemas.openxmlformats.org/drawingml/2006/picture">
                 <pic:pic>
                   <pic:nvPicPr>
-                    <pic:cNvPr id="0" name="mara-Tn2_AY123253__Tn2__1-4950.png"/>
+                    <pic:cNvPr id="0" name="locus-map-Tn2_AY123253__Tn2__1-4950.png"/>
                     <pic:cNvPicPr/>
                   </pic:nvPicPr>
                   <pic:blipFill>
@@ -9959,7 +9959,7 @@
           <w:color w:val="5B6570"/>
           <w:sz w:val="17"/>
         </w:rPr>
-        <w:t>MARA table generated from the same call and evidence ledger.</w:t>
+        <w:t>locus table generated from the same call and evidence ledger.</w:t>
       </w:r>
     </w:p>
     <w:p>
@@ -9971,7 +9971,7 @@
         <w:drawing>
           <wp:inline xmlns:a="http://schemas.openxmlformats.org/drawingml/2006/main" xmlns:pic="http://schemas.openxmlformats.org/drawingml/2006/picture">
             <wp:extent cx="8458200" cy="2512790"/>
-            <wp:docPr id="5" name="Picture 5" title="Tn2 MARA table" descr="MARA-style feature table for accession AY123253."/>
+            <wp:docPr id="5" name="Picture 5" title="Tn2 locus table" descr="locus feature table for accession AY123253."/>
             <wp:cNvGraphicFramePr>
               <a:graphicFrameLocks noChangeAspect="1"/>
             </wp:cNvGraphicFramePr>
@@ -9979,7 +9979,7 @@
               <a:graphicData uri="http://schemas.openxmlformats.org/drawingml/2006/picture">
                 <pic:pic>
                   <pic:nvPicPr>
-                    <pic:cNvPr id="0" name="mara-table-Tn2_AY123253__Tn2__1-4950.png"/>
+                    <pic:cNvPr id="0" name="locus-table-Tn2_AY123253__Tn2__1-4950.png"/>
                     <pic:cNvPicPr/>
                   </pic:nvPicPr>
                   <pic:blipFill>
@@ -11875,7 +11875,7 @@
           <w:color w:val="5B6570"/>
           <w:sz w:val="17"/>
         </w:rPr>
-        <w:t>MARA-style locus map generated from the detected and assembled features for Tn3_HM749966.</w:t>
+        <w:t>locus map generated from the detected and assembled features for Tn3_HM749966.</w:t>
       </w:r>
     </w:p>
     <w:p>
@@ -11887,7 +11887,7 @@
         <w:drawing>
           <wp:inline xmlns:a="http://schemas.openxmlformats.org/drawingml/2006/main" xmlns:pic="http://schemas.openxmlformats.org/drawingml/2006/picture">
             <wp:extent cx="8458200" cy="2008823"/>
-            <wp:docPr id="7" name="Picture 7" title="Tn3 MARA locus map" descr="MARA-style locus map for accession HM749966 with detected components and legend."/>
+            <wp:docPr id="7" name="Picture 7" title="Tn3 locus maps" descr="locus map for accession HM749966 with detected components and legend."/>
             <wp:cNvGraphicFramePr>
               <a:graphicFrameLocks noChangeAspect="1"/>
             </wp:cNvGraphicFramePr>
@@ -11895,7 +11895,7 @@
               <a:graphicData uri="http://schemas.openxmlformats.org/drawingml/2006/picture">
                 <pic:pic>
                   <pic:nvPicPr>
-                    <pic:cNvPr id="0" name="mara-Tn3_HM749966__Tn3__1-4948.png"/>
+                    <pic:cNvPr id="0" name="locus-map-Tn3_HM749966__Tn3__1-4948.png"/>
                     <pic:cNvPicPr/>
                   </pic:nvPicPr>
                   <pic:blipFill>
@@ -11931,7 +11931,7 @@
           <w:color w:val="5B6570"/>
           <w:sz w:val="17"/>
         </w:rPr>
-        <w:t>MARA table generated from the same call and evidence ledger.</w:t>
+        <w:t>locus table generated from the same call and evidence ledger.</w:t>
       </w:r>
     </w:p>
     <w:p>
@@ -11943,7 +11943,7 @@
         <w:drawing>
           <wp:inline xmlns:a="http://schemas.openxmlformats.org/drawingml/2006/main" xmlns:pic="http://schemas.openxmlformats.org/drawingml/2006/picture">
             <wp:extent cx="8458200" cy="2512790"/>
-            <wp:docPr id="8" name="Picture 8" title="Tn3 MARA table" descr="MARA-style feature table for accession HM749966."/>
+            <wp:docPr id="8" name="Picture 8" title="Tn3 locus table" descr="locus feature table for accession HM749966."/>
             <wp:cNvGraphicFramePr>
               <a:graphicFrameLocks noChangeAspect="1"/>
             </wp:cNvGraphicFramePr>
@@ -11951,7 +11951,7 @@
               <a:graphicData uri="http://schemas.openxmlformats.org/drawingml/2006/picture">
                 <pic:pic>
                   <pic:nvPicPr>
-                    <pic:cNvPr id="0" name="mara-table-Tn3_HM749966__Tn3__1-4948.png"/>
+                    <pic:cNvPr id="0" name="locus-table-Tn3_HM749966__Tn3__1-4948.png"/>
                     <pic:cNvPicPr/>
                   </pic:nvPicPr>
                   <pic:blipFill>
@@ -13847,7 +13847,7 @@
           <w:color w:val="5B6570"/>
           <w:sz w:val="17"/>
         </w:rPr>
-        <w:t>MARA-style locus map generated from the detected and assembled features for Tn2c_HM749967.</w:t>
+        <w:t>locus map generated from the detected and assembled features for Tn2c_HM749967.</w:t>
       </w:r>
     </w:p>
     <w:p>
@@ -13859,7 +13859,7 @@
         <w:drawing>
           <wp:inline xmlns:a="http://schemas.openxmlformats.org/drawingml/2006/main" xmlns:pic="http://schemas.openxmlformats.org/drawingml/2006/picture">
             <wp:extent cx="8458200" cy="2008823"/>
-            <wp:docPr id="10" name="Picture 10" title="Tn2c MARA locus map" descr="MARA-style locus map for accession HM749967 with detected components and legend."/>
+            <wp:docPr id="10" name="Picture 10" title="Tn2c locus maps" descr="locus map for accession HM749967 with detected components and legend."/>
             <wp:cNvGraphicFramePr>
               <a:graphicFrameLocks noChangeAspect="1"/>
             </wp:cNvGraphicFramePr>
@@ -13867,7 +13867,7 @@
               <a:graphicData uri="http://schemas.openxmlformats.org/drawingml/2006/picture">
                 <pic:pic>
                   <pic:nvPicPr>
-                    <pic:cNvPr id="0" name="mara-Tn2c_HM749967__Tn2c__1-4950.png"/>
+                    <pic:cNvPr id="0" name="locus-map-Tn2c_HM749967__Tn2c__1-4950.png"/>
                     <pic:cNvPicPr/>
                   </pic:nvPicPr>
                   <pic:blipFill>
@@ -13903,7 +13903,7 @@
           <w:color w:val="5B6570"/>
           <w:sz w:val="17"/>
         </w:rPr>
-        <w:t>MARA table generated from the same call and evidence ledger.</w:t>
+        <w:t>locus table generated from the same call and evidence ledger.</w:t>
       </w:r>
     </w:p>
     <w:p>
@@ -13915,7 +13915,7 @@
         <w:drawing>
           <wp:inline xmlns:a="http://schemas.openxmlformats.org/drawingml/2006/main" xmlns:pic="http://schemas.openxmlformats.org/drawingml/2006/picture">
             <wp:extent cx="8458200" cy="2696051"/>
-            <wp:docPr id="11" name="Picture 11" title="Tn2c MARA table" descr="MARA-style feature table for accession HM749967."/>
+            <wp:docPr id="11" name="Picture 11" title="Tn2c locus table" descr="locus feature table for accession HM749967."/>
             <wp:cNvGraphicFramePr>
               <a:graphicFrameLocks noChangeAspect="1"/>
             </wp:cNvGraphicFramePr>
@@ -13923,7 +13923,7 @@
               <a:graphicData uri="http://schemas.openxmlformats.org/drawingml/2006/picture">
                 <pic:pic>
                   <pic:nvPicPr>
-                    <pic:cNvPr id="0" name="mara-table-Tn2c_HM749967__Tn2c__1-4950.png"/>
+                    <pic:cNvPr id="0" name="locus-table-Tn2c_HM749967__Tn2c__1-4950.png"/>
                     <pic:cNvPicPr/>
                   </pic:nvPicPr>
                   <pic:blipFill>
@@ -15819,7 +15819,7 @@
           <w:color w:val="5B6570"/>
           <w:sz w:val="17"/>
         </w:rPr>
-        <w:t>MARA-style locus map generated from the detected and assembled features for Tn2_1_CP028717.</w:t>
+        <w:t>locus map generated from the detected and assembled features for Tn2_1_CP028717.</w:t>
       </w:r>
     </w:p>
     <w:p>
@@ -15831,7 +15831,7 @@
         <w:drawing>
           <wp:inline xmlns:a="http://schemas.openxmlformats.org/drawingml/2006/main" xmlns:pic="http://schemas.openxmlformats.org/drawingml/2006/picture">
             <wp:extent cx="8458200" cy="2008823"/>
-            <wp:docPr id="13" name="Picture 13" title="Tn2.1 MARA locus map" descr="MARA-style locus map for accession CP028717 with detected components and legend."/>
+            <wp:docPr id="13" name="Picture 13" title="Tn2.1 locus maps" descr="locus map for accession CP028717 with detected components and legend."/>
             <wp:cNvGraphicFramePr>
               <a:graphicFrameLocks noChangeAspect="1"/>
             </wp:cNvGraphicFramePr>
@@ -15839,7 +15839,7 @@
               <a:graphicData uri="http://schemas.openxmlformats.org/drawingml/2006/picture">
                 <pic:pic>
                   <pic:nvPicPr>
-                    <pic:cNvPr id="0" name="mara-Tn2_1_CP028717__Tn2.1__1-8979.png"/>
+                    <pic:cNvPr id="0" name="locus-map-Tn2_1_CP028717__Tn2.1__1-8979.png"/>
                     <pic:cNvPicPr/>
                   </pic:nvPicPr>
                   <pic:blipFill>
@@ -15879,7 +15879,7 @@
         <w:pStyle w:val="Heading1"/>
       </w:pPr>
       <w:r>
-        <w:t>6.5 Continued — Tn2.1 MARA feature table</w:t>
+        <w:t>6.5 Continued — Tn2.1 locus table</w:t>
       </w:r>
     </w:p>
     <w:p>
@@ -15895,7 +15895,7 @@
           <w:color w:val="5B6570"/>
           <w:sz w:val="17"/>
         </w:rPr>
-        <w:t>MARA table generated from the same call and evidence ledger.</w:t>
+        <w:t>locus table generated from the same call and evidence ledger.</w:t>
       </w:r>
     </w:p>
     <w:p>
@@ -15907,7 +15907,7 @@
         <w:drawing>
           <wp:inline xmlns:a="http://schemas.openxmlformats.org/drawingml/2006/main" xmlns:pic="http://schemas.openxmlformats.org/drawingml/2006/picture">
             <wp:extent cx="8458200" cy="3066098"/>
-            <wp:docPr id="14" name="Picture 14" title="Tn2.1 MARA table" descr="MARA-style feature table for accession CP028717."/>
+            <wp:docPr id="14" name="Picture 14" title="Tn2.1 locus table" descr="locus feature table for accession CP028717."/>
             <wp:cNvGraphicFramePr>
               <a:graphicFrameLocks noChangeAspect="1"/>
             </wp:cNvGraphicFramePr>
@@ -15915,7 +15915,7 @@
               <a:graphicData uri="http://schemas.openxmlformats.org/drawingml/2006/picture">
                 <pic:pic>
                   <pic:nvPicPr>
-                    <pic:cNvPr id="0" name="mara-table-Tn2_1_CP028717__Tn2.1__1-8979.png"/>
+                    <pic:cNvPr id="0" name="locus-table-Tn2_1_CP028717__Tn2.1__1-8979.png"/>
                     <pic:cNvPicPr/>
                   </pic:nvPicPr>
                   <pic:blipFill>
@@ -17446,7 +17446,7 @@
         <w:drawing>
           <wp:inline xmlns:a="http://schemas.openxmlformats.org/drawingml/2006/main" xmlns:pic="http://schemas.openxmlformats.org/drawingml/2006/picture">
             <wp:extent cx="8458200" cy="2008823"/>
-            <wp:docPr id="16" name="Picture 16" title="Tn2.1 nested ISEcp1-associated insertion" descr="MARA-style map of the separately indexed ISEcp1-associated insertion within Tn2.1."/>
+            <wp:docPr id="16" name="Picture 16" title="Tn2.1 nested ISEcp1-associated insertion" descr="locus map of the separately indexed ISEcp1-associated insertion within Tn2.1."/>
             <wp:cNvGraphicFramePr>
               <a:graphicFrameLocks noChangeAspect="1"/>
             </wp:cNvGraphicFramePr>
@@ -17454,7 +17454,7 @@
               <a:graphicData uri="http://schemas.openxmlformats.org/drawingml/2006/picture">
                 <pic:pic>
                   <pic:nvPicPr>
-                    <pic:cNvPr id="0" name="mara-Tn2_1_CP028717__ISEcp1-associated_insertion__130-4153.png"/>
+                    <pic:cNvPr id="0" name="locus-map-Tn2_1_CP028717__ISEcp1-associated_insertion__130-4153.png"/>
                     <pic:cNvPicPr/>
                   </pic:nvPicPr>
                   <pic:blipFill>
@@ -17486,7 +17486,7 @@
         <w:drawing>
           <wp:inline xmlns:a="http://schemas.openxmlformats.org/drawingml/2006/main" xmlns:pic="http://schemas.openxmlformats.org/drawingml/2006/picture">
             <wp:extent cx="8458200" cy="3066098"/>
-            <wp:docPr id="17" name="Picture 17" title="Tn2.1 nested ISEcp1-associated insertion table" descr="MARA-style feature table for the separately indexed ISEcp1-associated insertion within Tn2.1."/>
+            <wp:docPr id="17" name="Picture 17" title="Tn2.1 nested ISEcp1-associated insertion table" descr="locus feature table for the separately indexed ISEcp1-associated insertion within Tn2.1."/>
             <wp:cNvGraphicFramePr>
               <a:graphicFrameLocks noChangeAspect="1"/>
             </wp:cNvGraphicFramePr>
@@ -17494,7 +17494,7 @@
               <a:graphicData uri="http://schemas.openxmlformats.org/drawingml/2006/picture">
                 <pic:pic>
                   <pic:nvPicPr>
-                    <pic:cNvPr id="0" name="mara-table-Tn2_1_CP028717__ISEcp1-associated_insertion__130-4153.png"/>
+                    <pic:cNvPr id="0" name="locus-table-Tn2_1_CP028717__ISEcp1-associated_insertion__130-4153.png"/>
                     <pic:cNvPicPr/>
                   </pic:nvPicPr>
                   <pic:blipFill>
@@ -17927,7 +17927,7 @@
           <w:color w:val="5B6570"/>
           <w:sz w:val="17"/>
         </w:rPr>
-        <w:t>MARA-style locus map generated from the detected and assembled features for Tn1Mer_GQ160960.</w:t>
+        <w:t>locus map generated from the detected and assembled features for Tn1Mer_GQ160960.</w:t>
       </w:r>
     </w:p>
     <w:p>
@@ -17939,7 +17939,7 @@
         <w:drawing>
           <wp:inline xmlns:a="http://schemas.openxmlformats.org/drawingml/2006/main" xmlns:pic="http://schemas.openxmlformats.org/drawingml/2006/picture">
             <wp:extent cx="8458200" cy="2008823"/>
-            <wp:docPr id="18" name="Picture 18" title="Tn1Mer MARA locus map" descr="MARA-style locus map for accession GQ160960 with detected components and legend."/>
+            <wp:docPr id="18" name="Picture 18" title="Tn1Mer locus maps" descr="locus map for accession GQ160960 with detected components and legend."/>
             <wp:cNvGraphicFramePr>
               <a:graphicFrameLocks noChangeAspect="1"/>
             </wp:cNvGraphicFramePr>
@@ -17947,7 +17947,7 @@
               <a:graphicData uri="http://schemas.openxmlformats.org/drawingml/2006/picture">
                 <pic:pic>
                   <pic:nvPicPr>
-                    <pic:cNvPr id="0" name="mara-Tn1Mer_GQ160960__Tn1Mer__1-10491.png"/>
+                    <pic:cNvPr id="0" name="locus-map-Tn1Mer_GQ160960__Tn1Mer__1-10491.png"/>
                     <pic:cNvPicPr/>
                   </pic:nvPicPr>
                   <pic:blipFill>
@@ -17983,7 +17983,7 @@
           <w:color w:val="5B6570"/>
           <w:sz w:val="17"/>
         </w:rPr>
-        <w:t>MARA table generated from the same call and evidence ledger.</w:t>
+        <w:t>locus table generated from the same call and evidence ledger.</w:t>
       </w:r>
     </w:p>
     <w:p>
@@ -17995,7 +17995,7 @@
         <w:drawing>
           <wp:inline xmlns:a="http://schemas.openxmlformats.org/drawingml/2006/main" xmlns:pic="http://schemas.openxmlformats.org/drawingml/2006/picture">
             <wp:extent cx="8458200" cy="2882837"/>
-            <wp:docPr id="19" name="Picture 19" title="Tn1Mer MARA table" descr="MARA-style feature table for accession GQ160960."/>
+            <wp:docPr id="19" name="Picture 19" title="Tn1Mer locus table" descr="locus feature table for accession GQ160960."/>
             <wp:cNvGraphicFramePr>
               <a:graphicFrameLocks noChangeAspect="1"/>
             </wp:cNvGraphicFramePr>
@@ -18003,7 +18003,7 @@
               <a:graphicData uri="http://schemas.openxmlformats.org/drawingml/2006/picture">
                 <pic:pic>
                   <pic:nvPicPr>
-                    <pic:cNvPr id="0" name="mara-table-Tn1Mer_GQ160960__Tn1Mer__1-10491.png"/>
+                    <pic:cNvPr id="0" name="locus-table-Tn1Mer_GQ160960__Tn1Mer__1-10491.png"/>
                     <pic:cNvPicPr/>
                   </pic:nvPicPr>
                   <pic:blipFill>
@@ -19899,7 +19899,7 @@
           <w:color w:val="5B6570"/>
           <w:sz w:val="17"/>
         </w:rPr>
-        <w:t>MARA-style locus map generated from the detected and assembled features for Tn3_V00613.</w:t>
+        <w:t>locus map generated from the detected and assembled features for Tn3_V00613.</w:t>
       </w:r>
     </w:p>
     <w:p>
@@ -19911,7 +19911,7 @@
         <w:drawing>
           <wp:inline xmlns:a="http://schemas.openxmlformats.org/drawingml/2006/main" xmlns:pic="http://schemas.openxmlformats.org/drawingml/2006/picture">
             <wp:extent cx="8458200" cy="2008823"/>
-            <wp:docPr id="21" name="Picture 21" title="Tn3 MARA locus map" descr="MARA-style locus map for accession V00613 with detected components and legend."/>
+            <wp:docPr id="21" name="Picture 21" title="Tn3 locus maps" descr="locus map for accession V00613 with detected components and legend."/>
             <wp:cNvGraphicFramePr>
               <a:graphicFrameLocks noChangeAspect="1"/>
             </wp:cNvGraphicFramePr>
@@ -19919,7 +19919,7 @@
               <a:graphicData uri="http://schemas.openxmlformats.org/drawingml/2006/picture">
                 <pic:pic>
                   <pic:nvPicPr>
-                    <pic:cNvPr id="0" name="mara-Tn3_V00613__Tn3__1-4957.png"/>
+                    <pic:cNvPr id="0" name="locus-map-Tn3_V00613__Tn3__1-4957.png"/>
                     <pic:cNvPicPr/>
                   </pic:nvPicPr>
                   <pic:blipFill>
@@ -19955,7 +19955,7 @@
           <w:color w:val="5B6570"/>
           <w:sz w:val="17"/>
         </w:rPr>
-        <w:t>MARA table generated from the same call and evidence ledger.</w:t>
+        <w:t>locus table generated from the same call and evidence ledger.</w:t>
       </w:r>
     </w:p>
     <w:p>
@@ -19967,7 +19967,7 @@
         <w:drawing>
           <wp:inline xmlns:a="http://schemas.openxmlformats.org/drawingml/2006/main" xmlns:pic="http://schemas.openxmlformats.org/drawingml/2006/picture">
             <wp:extent cx="8458200" cy="2777109"/>
-            <wp:docPr id="22" name="Picture 22" title="Tn3 MARA table" descr="MARA-style feature table for accession V00613."/>
+            <wp:docPr id="22" name="Picture 22" title="Tn3 locus table" descr="locus feature table for accession V00613."/>
             <wp:cNvGraphicFramePr>
               <a:graphicFrameLocks noChangeAspect="1"/>
             </wp:cNvGraphicFramePr>
@@ -19975,7 +19975,7 @@
               <a:graphicData uri="http://schemas.openxmlformats.org/drawingml/2006/picture">
                 <pic:pic>
                   <pic:nvPicPr>
-                    <pic:cNvPr id="0" name="mara-table-Tn3_V00613__Tn3__1-4957.png"/>
+                    <pic:cNvPr id="0" name="locus-table-Tn3_V00613__Tn3__1-4957.png"/>
                     <pic:cNvPicPr/>
                   </pic:nvPicPr>
                   <pic:blipFill>
@@ -22126,7 +22126,7 @@
           <w:color w:val="5B6570"/>
           <w:sz w:val="17"/>
         </w:rPr>
-        <w:t>MARA-style locus map. Missing element ends/components remain visibly absent.</w:t>
+        <w:t>locus map. Missing element ends/components remain visibly absent.</w:t>
       </w:r>
     </w:p>
     <w:p>
@@ -22138,7 +22138,7 @@
         <w:drawing>
           <wp:inline xmlns:a="http://schemas.openxmlformats.org/drawingml/2006/main" xmlns:pic="http://schemas.openxmlformats.org/drawingml/2006/picture">
             <wp:extent cx="8458200" cy="2008823"/>
-            <wp:docPr id="25" name="Picture 25" title="pEK499 partial Tn1/Tn2/Tn3 locus map" descr="MARA-style partial-fragment map at pEK499 coordinates 38747 to 40671."/>
+            <wp:docPr id="25" name="Picture 25" title="pEK499 partial Tn1/Tn2/Tn3 locus map" descr="locus partial-fragment map at pEK499 coordinates 38747 to 40671."/>
             <wp:cNvGraphicFramePr>
               <a:graphicFrameLocks noChangeAspect="1"/>
             </wp:cNvGraphicFramePr>
@@ -22146,7 +22146,7 @@
               <a:graphicData uri="http://schemas.openxmlformats.org/drawingml/2006/picture">
                 <pic:pic>
                   <pic:nvPicPr>
-                    <pic:cNvPr id="0" name="mara-EU935739.1__Tn1-2-3_fragment__38747-40671.png"/>
+                    <pic:cNvPr id="0" name="locus-map-EU935739.1__Tn1-2-3_fragment__38747-40671.png"/>
                     <pic:cNvPicPr/>
                   </pic:nvPicPr>
                   <pic:blipFill>
@@ -22182,7 +22182,7 @@
           <w:color w:val="5B6570"/>
           <w:sz w:val="17"/>
         </w:rPr>
-        <w:t>MARA table for the partial call. The partial status and incomplete grammar are explicit.</w:t>
+        <w:t>locus table for the partial call. The partial status and incomplete grammar are explicit.</w:t>
       </w:r>
     </w:p>
     <w:p>
@@ -22194,7 +22194,7 @@
         <w:drawing>
           <wp:inline xmlns:a="http://schemas.openxmlformats.org/drawingml/2006/main" xmlns:pic="http://schemas.openxmlformats.org/drawingml/2006/picture">
             <wp:extent cx="8458200" cy="2061686"/>
-            <wp:docPr id="26" name="Picture 26" title="pEK499 partial Tn1/Tn2/Tn3 table" descr="MARA table for the pEK499 fragment at 38747 to 40671."/>
+            <wp:docPr id="26" name="Picture 26" title="pEK499 partial Tn1/Tn2/Tn3 table" descr="locus table for the pEK499 fragment at 38747 to 40671."/>
             <wp:cNvGraphicFramePr>
               <a:graphicFrameLocks noChangeAspect="1"/>
             </wp:cNvGraphicFramePr>
@@ -22202,7 +22202,7 @@
               <a:graphicData uri="http://schemas.openxmlformats.org/drawingml/2006/picture">
                 <pic:pic>
                   <pic:nvPicPr>
-                    <pic:cNvPr id="0" name="mara-table-EU935739.1__Tn1-2-3_fragment__38747-40671.png"/>
+                    <pic:cNvPr id="0" name="locus-table-EU935739.1__Tn1-2-3_fragment__38747-40671.png"/>
                     <pic:cNvPicPr/>
                   </pic:nvPicPr>
                   <pic:blipFill>
@@ -22274,7 +22274,7 @@
           <w:color w:val="5B6570"/>
           <w:sz w:val="17"/>
         </w:rPr>
-        <w:t>MARA-style locus map. Missing element ends/components remain visibly absent.</w:t>
+        <w:t>locus map. Missing element ends/components remain visibly absent.</w:t>
       </w:r>
     </w:p>
     <w:p>
@@ -22286,7 +22286,7 @@
         <w:drawing>
           <wp:inline xmlns:a="http://schemas.openxmlformats.org/drawingml/2006/main" xmlns:pic="http://schemas.openxmlformats.org/drawingml/2006/picture">
             <wp:extent cx="8458200" cy="2008823"/>
-            <wp:docPr id="27" name="Picture 27" title="pEK499 partial Tn1/Tn2/Tn3 locus map" descr="MARA-style partial-fragment map at pEK499 coordinates 60316 to 62561."/>
+            <wp:docPr id="27" name="Picture 27" title="pEK499 partial Tn1/Tn2/Tn3 locus map" descr="locus partial-fragment map at pEK499 coordinates 60316 to 62561."/>
             <wp:cNvGraphicFramePr>
               <a:graphicFrameLocks noChangeAspect="1"/>
             </wp:cNvGraphicFramePr>
@@ -22294,7 +22294,7 @@
               <a:graphicData uri="http://schemas.openxmlformats.org/drawingml/2006/picture">
                 <pic:pic>
                   <pic:nvPicPr>
-                    <pic:cNvPr id="0" name="mara-EU935739.1__Tn1-2-3_fragment__60316-62561.png"/>
+                    <pic:cNvPr id="0" name="locus-map-EU935739.1__Tn1-2-3_fragment__60316-62561.png"/>
                     <pic:cNvPicPr/>
                   </pic:nvPicPr>
                   <pic:blipFill>
@@ -22330,7 +22330,7 @@
           <w:color w:val="5B6570"/>
           <w:sz w:val="17"/>
         </w:rPr>
-        <w:t>MARA table for the partial call. The partial status and incomplete grammar are explicit.</w:t>
+        <w:t>locus table for the partial call. The partial status and incomplete grammar are explicit.</w:t>
       </w:r>
     </w:p>
     <w:p>
@@ -22342,7 +22342,7 @@
         <w:drawing>
           <wp:inline xmlns:a="http://schemas.openxmlformats.org/drawingml/2006/main" xmlns:pic="http://schemas.openxmlformats.org/drawingml/2006/picture">
             <wp:extent cx="8458200" cy="2421160"/>
-            <wp:docPr id="28" name="Picture 28" title="pEK499 partial Tn1/Tn2/Tn3 table" descr="MARA table for the pEK499 fragment at 60316 to 62561."/>
+            <wp:docPr id="28" name="Picture 28" title="pEK499 partial Tn1/Tn2/Tn3 table" descr="locus table for the pEK499 fragment at 60316 to 62561."/>
             <wp:cNvGraphicFramePr>
               <a:graphicFrameLocks noChangeAspect="1"/>
             </wp:cNvGraphicFramePr>
@@ -22350,7 +22350,7 @@
               <a:graphicData uri="http://schemas.openxmlformats.org/drawingml/2006/picture">
                 <pic:pic>
                   <pic:nvPicPr>
-                    <pic:cNvPr id="0" name="mara-table-EU935739.1__Tn1-2-3_fragment__60316-62561.png"/>
+                    <pic:cNvPr id="0" name="locus-table-EU935739.1__Tn1-2-3_fragment__60316-62561.png"/>
                     <pic:cNvPicPr/>
                   </pic:nvPicPr>
                   <pic:blipFill>
@@ -23311,7 +23311,7 @@
         <w:drawing>
           <wp:inline xmlns:a="http://schemas.openxmlformats.org/drawingml/2006/main" xmlns:pic="http://schemas.openxmlformats.org/drawingml/2006/picture">
             <wp:extent cx="8458200" cy="2008823"/>
-            <wp:docPr id="30" name="Picture 30" title="Arbitrary contig Tn1-like MARA map" descr="MARA-style map of the detected Tn1-like locus on the arbitrary contig."/>
+            <wp:docPr id="30" name="Picture 30" title="Arbitrary contig Tn1-like locus map" descr="locus map of the detected Tn1-like locus on the arbitrary contig."/>
             <wp:cNvGraphicFramePr>
               <a:graphicFrameLocks noChangeAspect="1"/>
             </wp:cNvGraphicFramePr>
@@ -23319,7 +23319,7 @@
               <a:graphicData uri="http://schemas.openxmlformats.org/drawingml/2006/picture">
                 <pic:pic>
                   <pic:nvPicPr>
-                    <pic:cNvPr id="0" name="mara-arbitrary_demo_contig__Tn1-like__8001-12949.png"/>
+                    <pic:cNvPr id="0" name="locus-map-arbitrary_demo_contig__Tn1-like__8001-12949.png"/>
                     <pic:cNvPicPr/>
                   </pic:nvPicPr>
                   <pic:blipFill>
@@ -23351,7 +23351,7 @@
         <w:drawing>
           <wp:inline xmlns:a="http://schemas.openxmlformats.org/drawingml/2006/main" xmlns:pic="http://schemas.openxmlformats.org/drawingml/2006/picture">
             <wp:extent cx="8458200" cy="2421160"/>
-            <wp:docPr id="31" name="Picture 31" title="Arbitrary contig Tn1-like MARA table" descr="MARA-style evidence table for the detected Tn1-like locus."/>
+            <wp:docPr id="31" name="Picture 31" title="Arbitrary contig Tn1-like locus table" descr="locus evidence table for the detected Tn1-like locus."/>
             <wp:cNvGraphicFramePr>
               <a:graphicFrameLocks noChangeAspect="1"/>
             </wp:cNvGraphicFramePr>
@@ -23359,7 +23359,7 @@
               <a:graphicData uri="http://schemas.openxmlformats.org/drawingml/2006/picture">
                 <pic:pic>
                   <pic:nvPicPr>
-                    <pic:cNvPr id="0" name="mara-table-arbitrary_demo_contig__Tn1-like__8001-12949.png"/>
+                    <pic:cNvPr id="0" name="locus-table-arbitrary_demo_contig__Tn1-like__8001-12949.png"/>
                     <pic:cNvPicPr/>
                   </pic:nvPicPr>
                   <pic:blipFill>
@@ -23427,7 +23427,7 @@
         <w:drawing>
           <wp:inline xmlns:a="http://schemas.openxmlformats.org/drawingml/2006/main" xmlns:pic="http://schemas.openxmlformats.org/drawingml/2006/picture">
             <wp:extent cx="7909560" cy="1878520"/>
-            <wp:docPr id="32" name="Picture 32" title="Arbitrary contig Tn2-like MARA map" descr="MARA-style map of the detected Tn2-like locus on the arbitrary contig."/>
+            <wp:docPr id="32" name="Picture 32" title="Arbitrary contig Tn2-like locus map" descr="locus map of the detected Tn2-like locus on the arbitrary contig."/>
             <wp:cNvGraphicFramePr>
               <a:graphicFrameLocks noChangeAspect="1"/>
             </wp:cNvGraphicFramePr>
@@ -23435,7 +23435,7 @@
               <a:graphicData uri="http://schemas.openxmlformats.org/drawingml/2006/picture">
                 <pic:pic>
                   <pic:nvPicPr>
-                    <pic:cNvPr id="0" name="mara-arbitrary_demo_contig__Tn2-like__19950-25699.png"/>
+                    <pic:cNvPr id="0" name="locus-map-arbitrary_demo_contig__Tn2-like__19950-25699.png"/>
                     <pic:cNvPicPr/>
                   </pic:nvPicPr>
                   <pic:blipFill>
@@ -23467,7 +23467,7 @@
         <w:drawing>
           <wp:inline xmlns:a="http://schemas.openxmlformats.org/drawingml/2006/main" xmlns:pic="http://schemas.openxmlformats.org/drawingml/2006/picture">
             <wp:extent cx="7909560" cy="2511285"/>
-            <wp:docPr id="33" name="Picture 33" title="Arbitrary contig Tn2-like MARA table" descr="MARA-style evidence table for the detected Tn2-like locus."/>
+            <wp:docPr id="33" name="Picture 33" title="Arbitrary contig Tn2-like locus table" descr="locus evidence table for the detected Tn2-like locus."/>
             <wp:cNvGraphicFramePr>
               <a:graphicFrameLocks noChangeAspect="1"/>
             </wp:cNvGraphicFramePr>
@@ -23475,7 +23475,7 @@
               <a:graphicData uri="http://schemas.openxmlformats.org/drawingml/2006/picture">
                 <pic:pic>
                   <pic:nvPicPr>
-                    <pic:cNvPr id="0" name="mara-table-arbitrary_demo_contig__Tn2-like__19950-25699.png"/>
+                    <pic:cNvPr id="0" name="locus-table-arbitrary_demo_contig__Tn2-like__19950-25699.png"/>
                     <pic:cNvPicPr/>
                   </pic:nvPicPr>
                   <pic:blipFill>
@@ -23543,7 +23543,7 @@
         <w:drawing>
           <wp:inline xmlns:a="http://schemas.openxmlformats.org/drawingml/2006/main" xmlns:pic="http://schemas.openxmlformats.org/drawingml/2006/picture">
             <wp:extent cx="8458200" cy="2008823"/>
-            <wp:docPr id="34" name="Picture 34" title="Arbitrary contig Tn3-like MARA map" descr="MARA-style map of the detected Tn3-like locus on the arbitrary contig."/>
+            <wp:docPr id="34" name="Picture 34" title="Arbitrary contig Tn3-like locus map" descr="locus map of the detected Tn3-like locus on the arbitrary contig."/>
             <wp:cNvGraphicFramePr>
               <a:graphicFrameLocks noChangeAspect="1"/>
             </wp:cNvGraphicFramePr>
@@ -23551,7 +23551,7 @@
               <a:graphicData uri="http://schemas.openxmlformats.org/drawingml/2006/picture">
                 <pic:pic>
                   <pic:nvPicPr>
-                    <pic:cNvPr id="0" name="mara-arbitrary_demo_contig__Tn3-like__31700-36647.png"/>
+                    <pic:cNvPr id="0" name="locus-map-arbitrary_demo_contig__Tn3-like__31700-36647.png"/>
                     <pic:cNvPicPr/>
                   </pic:nvPicPr>
                   <pic:blipFill>
@@ -23583,7 +23583,7 @@
         <w:drawing>
           <wp:inline xmlns:a="http://schemas.openxmlformats.org/drawingml/2006/main" xmlns:pic="http://schemas.openxmlformats.org/drawingml/2006/picture">
             <wp:extent cx="8458200" cy="2421160"/>
-            <wp:docPr id="35" name="Picture 35" title="Arbitrary contig Tn3-like MARA table" descr="MARA-style evidence table for the detected Tn3-like locus."/>
+            <wp:docPr id="35" name="Picture 35" title="Arbitrary contig Tn3-like locus table" descr="locus evidence table for the detected Tn3-like locus."/>
             <wp:cNvGraphicFramePr>
               <a:graphicFrameLocks noChangeAspect="1"/>
             </wp:cNvGraphicFramePr>
@@ -23591,7 +23591,7 @@
               <a:graphicData uri="http://schemas.openxmlformats.org/drawingml/2006/picture">
                 <pic:pic>
                   <pic:nvPicPr>
-                    <pic:cNvPr id="0" name="mara-table-arbitrary_demo_contig__Tn3-like__31700-36647.png"/>
+                    <pic:cNvPr id="0" name="locus-table-arbitrary_demo_contig__Tn3-like__31700-36647.png"/>
                     <pic:cNvPicPr/>
                   </pic:nvPicPr>
                   <pic:blipFill>
@@ -23956,7 +23956,7 @@
                 <w:color w:val="17212B"/>
                 <w:sz w:val="18"/>
               </w:rPr>
-              <w:t>mara/*.svg</w:t>
+              <w:t>locus-map/*.svg</w:t>
             </w:r>
           </w:p>
         </w:tc>
@@ -23983,7 +23983,7 @@
                 <w:color w:val="17212B"/>
                 <w:sz w:val="18"/>
               </w:rPr>
-              <w:t>Readable locus-centred MARA-style map with its own legend/key.</w:t>
+              <w:t>Readable locus-centred locus map with its own legend/key.</w:t>
             </w:r>
           </w:p>
         </w:tc>
@@ -24012,7 +24012,7 @@
                 <w:color w:val="17212B"/>
                 <w:sz w:val="18"/>
               </w:rPr>
-              <w:t>mara-table/*.svg</w:t>
+              <w:t>locus-table/*.svg</w:t>
             </w:r>
           </w:p>
         </w:tc>
@@ -24039,7 +24039,7 @@
                 <w:color w:val="17212B"/>
                 <w:sz w:val="18"/>
               </w:rPr>
-              <w:t>MARA-style feature/evidence table for the same locus.</w:t>
+              <w:t>locus feature/evidence table for the same locus.</w:t>
             </w:r>
           </w:p>
         </w:tc>
@@ -24280,7 +24280,7 @@
           <w:color w:val="17212B"/>
           <w:sz w:val="20"/>
         </w:rPr>
-        <w:t>The MARA locus map prioritises biological readability around one locus.</w:t>
+        <w:t>The locus maps prioritises biological readability around one locus.</w:t>
       </w:r>
     </w:p>
     <w:p>
@@ -24296,7 +24296,7 @@
           <w:color w:val="17212B"/>
           <w:sz w:val="20"/>
         </w:rPr>
-        <w:t>The MARA table is the feature-by-feature description, including evidence and call qualification.</w:t>
+        <w:t>The locus table is the feature-by-feature description, including evidence and call qualification.</w:t>
       </w:r>
     </w:p>
     <w:p>
@@ -24344,7 +24344,7 @@
           <w:color w:val="17212B"/>
           <w:sz w:val="20"/>
         </w:rPr>
-        <w:t>The legend/key is embedded in every MARA map and table so the symbols are interpretable without prior MARA experience.</w:t>
+        <w:t>The legend/key is embedded in every locus map and table so the symbols are interpretable without prior experience of the notation.</w:t>
       </w:r>
     </w:p>
     <w:p>
@@ -24432,7 +24432,7 @@
           <w:color w:val="17212B"/>
           <w:sz w:val="20"/>
         </w:rPr>
-        <w:t>Exhaustive subtype coverage or complete parity with every component and compound element described across all MARA papers.</w:t>
+        <w:t>Exhaustive subtype coverage or complete parity with every component and compound element described across the source literature.</w:t>
       </w:r>
     </w:p>
     <w:p>
@@ -24512,7 +24512,7 @@
           <w:color w:val="17212B"/>
           <w:sz w:val="21"/>
         </w:rPr>
-        <w:t>Have Sally review the human-readable definitions and the embedded figures; freeze accepted naming decisions; then evaluate a blinded accession set containing true Tn1/Tn2/Tn3 examples, close variants, fragmented assemblies and related Tn3-family elements. Report locus-level precision/recall, boundary error and exact-versus-qualified naming accuracy.</w:t>
+        <w:t>Have a domain expert review the human-readable definitions and embedded figures; freeze accepted naming decisions; then evaluate a blinded accession set containing true Tn1/Tn2/Tn3 examples, close variants, fragmented assemblies and related Tn3-family elements. Report locus-level precision/recall, boundary error and exact-versus-qualified naming accuracy.</w:t>
       </w:r>
     </w:p>
     <w:p>

</xml_diff>

<commit_message>
Replace weighted Tn123 classifier with backbone haplotypes
</commit_message>
<xml_diff>
--- a/reports/Matryoshka-Tn123-definition-and-validation-report.docx
+++ b/reports/Matryoshka-Tn123-definition-and-validation-report.docx
@@ -1207,7 +1207,7 @@
           <w:color w:val="17212B"/>
           <w:sz w:val="20"/>
         </w:rPr>
-        <w:t>A complete locus is classified from its component grammar and weighted local component profiles; a whole-element comparison is secondary confirmation.</w:t>
+        <w:t>A complete locus is classified from its component grammar and categorical tnpR/tnpA backbone haplotype; a whole-element comparison is secondary confirmation.</w:t>
       </w:r>
     </w:p>
     <w:p>
@@ -1740,7 +1740,7 @@
                 <w:color w:val="17212B"/>
                 <w:sz w:val="18"/>
               </w:rPr>
-              <w:t>Score the detected component profiles and assign a type only when the declared threshold and margin are met.</w:t>
+              <w:t>Assign tnpR and tnpA to declared profile groups, then match their categorical backbone haplotype.</w:t>
             </w:r>
           </w:p>
         </w:tc>
@@ -2106,7 +2106,7 @@
                 <w:color w:val="17212B"/>
                 <w:sz w:val="18"/>
               </w:rPr>
-              <w:t>Complete grammar and a clear best weighted component profile, without requiring a complete-element match.</w:t>
+              <w:t>Complete grammar and a declared tnpR/tnpA backbone haplotype, without requiring a complete-element match.</w:t>
             </w:r>
           </w:p>
         </w:tc>
@@ -2191,6 +2191,62 @@
                 <w:color w:val="17212B"/>
                 <w:sz w:val="18"/>
               </w:rPr>
+              <w:t>Tn1/Tn2/Tn3-group mosaic</w:t>
+            </w:r>
+          </w:p>
+        </w:tc>
+        <w:tc>
+          <w:tcPr>
+            <w:tcW w:type="dxa" w:w="5660"/>
+            <w:tcMar>
+              <w:top w:w="80" w:type="dxa"/>
+              <w:start w:w="120" w:type="dxa"/>
+              <w:bottom w:w="80" w:type="dxa"/>
+              <w:end w:w="120" w:type="dxa"/>
+            </w:tcMar>
+            <w:vAlign w:val="center"/>
+          </w:tcPr>
+          <w:p>
+            <w:pPr>
+              <w:spacing w:after="0"/>
+            </w:pPr>
+            <w:r>
+              <w:rPr>
+                <w:rFonts w:ascii="Aptos" w:hAnsi="Aptos"/>
+                <w:b w:val="0"/>
+                <w:i w:val="0"/>
+                <w:color w:val="17212B"/>
+                <w:sz w:val="18"/>
+              </w:rPr>
+              <w:t>Complete grammar and confident backbone groups, but their combination is not a declared Tn1, Tn2 or Tn3 haplotype.</w:t>
+            </w:r>
+          </w:p>
+        </w:tc>
+      </w:tr>
+      <w:tr>
+        <w:tc>
+          <w:tcPr>
+            <w:tcW w:type="dxa" w:w="2800"/>
+            <w:tcMar>
+              <w:top w:w="80" w:type="dxa"/>
+              <w:start w:w="120" w:type="dxa"/>
+              <w:bottom w:w="80" w:type="dxa"/>
+              <w:end w:w="120" w:type="dxa"/>
+            </w:tcMar>
+            <w:vAlign w:val="center"/>
+          </w:tcPr>
+          <w:p>
+            <w:pPr>
+              <w:spacing w:after="0"/>
+            </w:pPr>
+            <w:r>
+              <w:rPr>
+                <w:rFonts w:ascii="Aptos" w:hAnsi="Aptos"/>
+                <w:b w:val="0"/>
+                <w:i w:val="0"/>
+                <w:color w:val="17212B"/>
+                <w:sz w:val="18"/>
+              </w:rPr>
               <w:t>Unresolved Tn1/Tn2/Tn3-group unit</w:t>
             </w:r>
           </w:p>
@@ -2218,7 +2274,7 @@
                 <w:color w:val="17212B"/>
                 <w:sz w:val="18"/>
               </w:rPr>
-              <w:t>The group grammar is supported but the component-profile score or type margin is insufficient.</w:t>
+              <w:t>The group grammar is supported but a required backbone profile group is missing or ambiguous.</w:t>
             </w:r>
           </w:p>
         </w:tc>
@@ -2673,7 +2729,7 @@
                 <w:color w:val="17212B"/>
                 <w:sz w:val="18"/>
               </w:rPr>
-              <w:t>Assign family/type-like, fragment or unresolved result from weighted component profiles</w:t>
+              <w:t>Assign family/type-like, mosaic, fragment or unresolved result from the categorical backbone haplotype</w:t>
             </w:r>
           </w:p>
         </w:tc>
@@ -3370,7 +3426,7 @@
                 <w:color w:val="17212B"/>
                 <w:sz w:val="18"/>
               </w:rPr>
-              <w:t>Weighted component-profile type rules, exact-reference confirmation and fragment rules.</w:t>
+              <w:t>Categorical backbone-haplotype rules, exact-reference confirmation and fragment rules.</w:t>
             </w:r>
           </w:p>
         </w:tc>
@@ -3639,7 +3695,7 @@
                 <w:b/>
                 <w:i w:val="0"/>
                 <w:color w:val="17365D"/>
-                <w:sz w:val="18"/>
+                <w:sz w:val="17"/>
               </w:rPr>
               <w:t>Decision</w:t>
             </w:r>
@@ -3667,7 +3723,7 @@
                 <w:b/>
                 <w:i w:val="0"/>
                 <w:color w:val="17365D"/>
-                <w:sz w:val="18"/>
+                <w:sz w:val="17"/>
               </w:rPr>
               <w:t>Rule</w:t>
             </w:r>
@@ -3696,7 +3752,7 @@
                 <w:b w:val="0"/>
                 <w:i w:val="0"/>
                 <w:color w:val="17212B"/>
-                <w:sz w:val="18"/>
+                <w:sz w:val="17"/>
               </w:rPr>
               <w:t>Exact declared definition</w:t>
             </w:r>
@@ -3723,9 +3779,9 @@
                 <w:b w:val="0"/>
                 <w:i w:val="0"/>
                 <w:color w:val="17212B"/>
-                <w:sz w:val="18"/>
-              </w:rPr>
-              <w:t>100% identity, 100% reference coverage, both ends, zero mismatches/insertions/deletions and complete component grammar.</w:t>
+                <w:sz w:val="17"/>
+              </w:rPr>
+              <w:t>100% identity and coverage; both ends; zero mismatches or indels; complete grammar.</w:t>
             </w:r>
           </w:p>
         </w:tc>
@@ -3752,9 +3808,9 @@
                 <w:b w:val="0"/>
                 <w:i w:val="0"/>
                 <w:color w:val="17212B"/>
-                <w:sz w:val="18"/>
-              </w:rPr>
-              <w:t>Rule-based type</w:t>
+                <w:sz w:val="17"/>
+              </w:rPr>
+              <w:t>Individual gene profile</w:t>
             </w:r>
           </w:p>
         </w:tc>
@@ -3779,9 +3835,9 @@
                 <w:b w:val="0"/>
                 <w:i w:val="0"/>
                 <w:color w:val="17212B"/>
-                <w:sz w:val="18"/>
-              </w:rPr>
-              <w:t>Complete grammar; weighted local component score at least 90%; best type exceeds the next by at least 0.5 points.</w:t>
+                <w:sz w:val="17"/>
+              </w:rPr>
+              <w:t>tnpR and tnpA are each placed in a group at &gt;=90%, with a &gt;=0.5-point group margin.</w:t>
             </w:r>
           </w:p>
         </w:tc>
@@ -3808,9 +3864,9 @@
                 <w:b w:val="0"/>
                 <w:i w:val="0"/>
                 <w:color w:val="17212B"/>
-                <w:sz w:val="18"/>
-              </w:rPr>
-              <w:t>Component weights</w:t>
+                <w:sz w:val="17"/>
+              </w:rPr>
+              <w:t>Rule-based type</w:t>
             </w:r>
           </w:p>
         </w:tc>
@@ -3835,9 +3891,9 @@
                 <w:b w:val="0"/>
                 <w:i w:val="0"/>
                 <w:color w:val="17212B"/>
-                <w:sz w:val="18"/>
-              </w:rPr>
-              <w:t>blaTEM 1; tnpR 2; res 3; tnpA 3. The combined profile, rather than a single gene, assigns the type-like call.</w:t>
+                <w:sz w:val="17"/>
+              </w:rPr>
+              <w:t>Complete grammar plus a declared categorical pair: R13+A12 = Tn1; R2+A12 = Tn2; R13+A3 = Tn3.</w:t>
             </w:r>
           </w:p>
         </w:tc>
@@ -3864,9 +3920,9 @@
                 <w:b w:val="0"/>
                 <w:i w:val="0"/>
                 <w:color w:val="17212B"/>
-                <w:sz w:val="18"/>
-              </w:rPr>
-              <w:t>Secondary reference</w:t>
+                <w:sz w:val="17"/>
+              </w:rPr>
+              <w:t>Mosaic or unresolved</w:t>
             </w:r>
           </w:p>
         </w:tc>
@@ -3891,9 +3947,9 @@
                 <w:b w:val="0"/>
                 <w:i w:val="0"/>
                 <w:color w:val="17212B"/>
-                <w:sz w:val="18"/>
-              </w:rPr>
-              <w:t>At least 95% identity and 80% coverage; used for context or exact confirmation, never to create the family/type.</w:t>
+                <w:sz w:val="17"/>
+              </w:rPr>
+              <w:t>Another confident pair is mosaic; a missing or ambiguous group is unresolved. Scores are never averaged.</w:t>
             </w:r>
           </w:p>
         </w:tc>
@@ -3920,7 +3976,63 @@
                 <w:b w:val="0"/>
                 <w:i w:val="0"/>
                 <w:color w:val="17212B"/>
-                <w:sz w:val="18"/>
+                <w:sz w:val="17"/>
+              </w:rPr>
+              <w:t>Secondary reference</w:t>
+            </w:r>
+          </w:p>
+        </w:tc>
+        <w:tc>
+          <w:tcPr>
+            <w:tcW w:type="dxa" w:w="5860"/>
+            <w:tcMar>
+              <w:top w:w="80" w:type="dxa"/>
+              <w:start w:w="120" w:type="dxa"/>
+              <w:bottom w:w="80" w:type="dxa"/>
+              <w:end w:w="120" w:type="dxa"/>
+            </w:tcMar>
+            <w:vAlign w:val="center"/>
+          </w:tcPr>
+          <w:p>
+            <w:pPr>
+              <w:spacing w:after="0"/>
+            </w:pPr>
+            <w:r>
+              <w:rPr>
+                <w:rFonts w:ascii="Aptos" w:hAnsi="Aptos"/>
+                <w:b w:val="0"/>
+                <w:i w:val="0"/>
+                <w:color w:val="17212B"/>
+                <w:sz w:val="17"/>
+              </w:rPr>
+              <w:t>&gt;=95% identity and &gt;=80% coverage; context or exact confirmation only.</w:t>
+            </w:r>
+          </w:p>
+        </w:tc>
+      </w:tr>
+      <w:tr>
+        <w:tc>
+          <w:tcPr>
+            <w:tcW w:type="dxa" w:w="2600"/>
+            <w:tcMar>
+              <w:top w:w="80" w:type="dxa"/>
+              <w:start w:w="120" w:type="dxa"/>
+              <w:bottom w:w="80" w:type="dxa"/>
+              <w:end w:w="120" w:type="dxa"/>
+            </w:tcMar>
+            <w:vAlign w:val="center"/>
+          </w:tcPr>
+          <w:p>
+            <w:pPr>
+              <w:spacing w:after="0"/>
+            </w:pPr>
+            <w:r>
+              <w:rPr>
+                <w:rFonts w:ascii="Aptos" w:hAnsi="Aptos"/>
+                <w:b w:val="0"/>
+                <w:i w:val="0"/>
+                <w:color w:val="17212B"/>
+                <w:sz w:val="17"/>
               </w:rPr>
               <w:t>Fragment</w:t>
             </w:r>
@@ -3947,7 +4059,7 @@
                 <w:b w:val="0"/>
                 <w:i w:val="0"/>
                 <w:color w:val="17212B"/>
-                <w:sz w:val="18"/>
+                <w:sz w:val="17"/>
               </w:rPr>
               <w:t>At least 400 aligned reference bases; retained without a complete name.</w:t>
             </w:r>
@@ -4009,7 +4121,7 @@
           <w:color w:val="17212B"/>
           <w:sz w:val="22"/>
         </w:rPr>
-        <w:t>Call a Tn1-like candidate when the six required components are independently detected in the correct order and their weighted local profiles best support Tn1 above the declared score and margin. Upgrade that call to exact reviewed Tn1 only when an optional secondary comparison is a complete, gap-free and mismatch-free match to NC_008357. The canonical sequence carries blaTEM-2.</w:t>
+        <w:t>Call a Tn1-like candidate when the six required components are independently detected in the correct order, tnpR belongs to the shared Tn1/Tn3 profile group and tnpA belongs to the shared Tn1/Tn2 profile group. Upgrade that call to exact reviewed Tn1 only when an optional secondary comparison is a complete, gap-free and mismatch-free match to NC_008357. The canonical sequence carries blaTEM-2 as reported cargo; its allele does not determine the type.</w:t>
       </w:r>
     </w:p>
     <w:p>
@@ -4038,21 +4150,33 @@
         <w:br/>
         <w:t xml:space="preserve">  type_assignment:</w:t>
         <w:br/>
-        <w:t xml:space="preserve">    method: weighted component profiles</w:t>
+        <w:t xml:space="preserve">    method: categorical backbone haplotype</w:t>
         <w:br/>
-        <w:t xml:space="preserve">    discriminator_role_weights:</w:t>
+        <w:t xml:space="preserve">    required_discriminator_roles: [tnpR, tnpA]</w:t>
         <w:br/>
-        <w:t xml:space="preserve">      blaTEM: 1</w:t>
+        <w:t xml:space="preserve">    role_profile_groups:</w:t>
         <w:br/>
-        <w:t xml:space="preserve">      tnpR: 2</w:t>
+        <w:t xml:space="preserve">      tnpR:</w:t>
         <w:br/>
-        <w:t xml:space="preserve">      res: 3</w:t>
+        <w:t xml:space="preserve">        tnpR_Tn1_Tn3: [Tn1, Tn3]</w:t>
         <w:br/>
-        <w:t xml:space="preserve">      tnpA: 3</w:t>
+        <w:t xml:space="preserve">        tnpR_Tn2: [Tn2]</w:t>
         <w:br/>
-        <w:t xml:space="preserve">    minimum_component_profile_score_percent: 90</w:t>
+        <w:t xml:space="preserve">      tnpA:</w:t>
         <w:br/>
-        <w:t xml:space="preserve">    minimum_type_margin_percent: 0.5</w:t>
+        <w:t xml:space="preserve">        tnpA_Tn1_Tn2: [Tn1, Tn2]</w:t>
+        <w:br/>
+        <w:t xml:space="preserve">        tnpA_Tn3: [Tn3]</w:t>
+        <w:br/>
+        <w:t xml:space="preserve">    type_haplotypes:</w:t>
+        <w:br/>
+        <w:t xml:space="preserve">      Tn1: {tnpR: tnpR_Tn1_Tn3, tnpA: tnpA_Tn1_Tn2}</w:t>
+        <w:br/>
+        <w:t xml:space="preserve">      Tn2: {tnpR: tnpR_Tn2, tnpA: tnpA_Tn1_Tn2}</w:t>
+        <w:br/>
+        <w:t xml:space="preserve">      Tn3: {tnpR: tnpR_Tn1_Tn3, tnpA: tnpA_Tn3}</w:t>
+        <w:br/>
+        <w:t xml:space="preserve">    non_discriminator_roles: [blaTEM]</w:t>
         <w:br/>
         <w:t xml:space="preserve">  reference_comparison:</w:t>
         <w:br/>
@@ -17994,7 +18118,7 @@
       <w:r>
         <w:drawing>
           <wp:inline xmlns:a="http://schemas.openxmlformats.org/drawingml/2006/main" xmlns:pic="http://schemas.openxmlformats.org/drawingml/2006/picture">
-            <wp:extent cx="8458200" cy="2882837"/>
+            <wp:extent cx="8458200" cy="3252883"/>
             <wp:docPr id="19" name="Picture 19" title="Tn1Mer locus table" descr="locus feature table for accession GQ160960."/>
             <wp:cNvGraphicFramePr>
               <a:graphicFrameLocks noChangeAspect="1"/>
@@ -18015,7 +18139,7 @@
                   <pic:spPr>
                     <a:xfrm>
                       <a:off x="0" y="0"/>
-                      <a:ext cx="8458200" cy="2882837"/>
+                      <a:ext cx="8458200" cy="3252883"/>
                     </a:xfrm>
                     <a:prstGeom prst="rect"/>
                   </pic:spPr>
@@ -18070,7 +18194,7 @@
       <w:r>
         <w:drawing>
           <wp:inline xmlns:a="http://schemas.openxmlformats.org/drawingml/2006/main" xmlns:pic="http://schemas.openxmlformats.org/drawingml/2006/picture">
-            <wp:extent cx="8458200" cy="1462564"/>
+            <wp:extent cx="8458200" cy="1631728"/>
             <wp:docPr id="20" name="Picture 20" title="Tn1Mer hierarchy" descr="Original hierarchical annotation view for accession GQ160960."/>
             <wp:cNvGraphicFramePr>
               <a:graphicFrameLocks noChangeAspect="1"/>
@@ -18091,7 +18215,7 @@
                   <pic:spPr>
                     <a:xfrm>
                       <a:off x="0" y="0"/>
-                      <a:ext cx="8458200" cy="1462564"/>
+                      <a:ext cx="8458200" cy="1631728"/>
                     </a:xfrm>
                     <a:prstGeom prst="rect"/>
                   </pic:spPr>
@@ -22045,7 +22169,7 @@
       <w:r>
         <w:drawing>
           <wp:inline xmlns:a="http://schemas.openxmlformats.org/drawingml/2006/main" xmlns:pic="http://schemas.openxmlformats.org/drawingml/2006/picture">
-            <wp:extent cx="8458200" cy="2551557"/>
+            <wp:extent cx="8458200" cy="3009710"/>
             <wp:docPr id="24" name="Picture 24" title="pEK499 hierarchy" descr="Original hierarchy view of pEK499 showing all detected validated-profile features."/>
             <wp:cNvGraphicFramePr>
               <a:graphicFrameLocks noChangeAspect="1"/>
@@ -22066,7 +22190,7 @@
                   <pic:spPr>
                     <a:xfrm>
                       <a:off x="0" y="0"/>
-                      <a:ext cx="8458200" cy="2551557"/>
+                      <a:ext cx="8458200" cy="3009710"/>
                     </a:xfrm>
                     <a:prstGeom prst="rect"/>
                   </pic:spPr>
@@ -22341,7 +22465,7 @@
       <w:r>
         <w:drawing>
           <wp:inline xmlns:a="http://schemas.openxmlformats.org/drawingml/2006/main" xmlns:pic="http://schemas.openxmlformats.org/drawingml/2006/picture">
-            <wp:extent cx="8458200" cy="2421160"/>
+            <wp:extent cx="8458200" cy="3161252"/>
             <wp:docPr id="28" name="Picture 28" title="pEK499 partial Tn1/Tn2/Tn3 table" descr="locus table for the pEK499 fragment at 60316 to 62561."/>
             <wp:cNvGraphicFramePr>
               <a:graphicFrameLocks noChangeAspect="1"/>
@@ -22362,7 +22486,7 @@
                   <pic:spPr>
                     <a:xfrm>
                       <a:off x="0" y="0"/>
-                      <a:ext cx="8458200" cy="2421160"/>
+                      <a:ext cx="8458200" cy="3161252"/>
                     </a:xfrm>
                     <a:prstGeom prst="rect"/>
                   </pic:spPr>
@@ -22567,7 +22691,7 @@
                 <w:color w:val="17365D"/>
                 <w:sz w:val="17"/>
               </w:rPr>
-              <w:t>Component score</w:t>
+              <w:t>Backbone haplotype</w:t>
             </w:r>
           </w:p>
         </w:tc>
@@ -22760,7 +22884,7 @@
                 <w:color w:val="17212B"/>
                 <w:sz w:val="17"/>
               </w:rPr>
-              <w:t>99.592</w:t>
+              <w:t>tnpR_Tn1_Tn3 + tnpA_Tn1_Tn2</w:t>
             </w:r>
           </w:p>
         </w:tc>
@@ -22952,7 +23076,7 @@
                 <w:color w:val="17212B"/>
                 <w:sz w:val="17"/>
               </w:rPr>
-              <w:t>100.0</w:t>
+              <w:t>tnpR_Tn2 + tnpA_Tn1_Tn2</w:t>
             </w:r>
           </w:p>
         </w:tc>
@@ -23144,7 +23268,7 @@
                 <w:color w:val="17212B"/>
                 <w:sz w:val="17"/>
               </w:rPr>
-              <w:t>100.0</w:t>
+              <w:t>tnpR_Tn1_Tn3 + tnpA_Tn3</w:t>
             </w:r>
           </w:p>
         </w:tc>
@@ -23299,7 +23423,7 @@
           <w:color w:val="17212B"/>
           <w:sz w:val="21"/>
         </w:rPr>
-        <w:t>The component grammar is complete and the expert component-profile rules assign Tn1. No complete Tn1/Tn2/Tn3 reference comparison was run; the visible call is Tn1-like. Insertions and other structural differences are retained from split component alignments and shown in the map/table.</w:t>
+        <w:t>The component grammar is complete and the expert backbone-haplotype rule assigns Tn1. No complete Tn1/Tn2/Tn3 reference comparison was run; the visible call is Tn1-like. Insertions and other structural differences are retained from split component alignments and shown in the map/table.</w:t>
       </w:r>
     </w:p>
     <w:p>
@@ -23415,7 +23539,7 @@
           <w:color w:val="17212B"/>
           <w:sz w:val="21"/>
         </w:rPr>
-        <w:t>The component grammar is complete and the expert component-profile rules assign Tn2. No complete Tn1/Tn2/Tn3 reference comparison was run; the visible call is Tn2-like. Insertions and other structural differences are retained from split component alignments and shown in the map/table.</w:t>
+        <w:t>The component grammar is complete and the expert backbone-haplotype rule assigns Tn2. No complete Tn1/Tn2/Tn3 reference comparison was run; the visible call is Tn2-like. Insertions and other structural differences are retained from split component alignments and shown in the map/table.</w:t>
       </w:r>
     </w:p>
     <w:p>
@@ -23531,7 +23655,7 @@
           <w:color w:val="17212B"/>
           <w:sz w:val="21"/>
         </w:rPr>
-        <w:t>The component grammar is complete and the expert component-profile rules assign Tn3. No complete Tn1/Tn2/Tn3 reference comparison was run; the visible call is Tn3-like. Insertions and other structural differences are retained from split component alignments and shown in the map/table.</w:t>
+        <w:t>The component grammar is complete and the expert backbone-haplotype rule assigns Tn3. No complete Tn1/Tn2/Tn3 reference comparison was run; the visible call is Tn3-like. Insertions and other structural differences are retained from split component alignments and shown in the map/table.</w:t>
       </w:r>
     </w:p>
     <w:p>

</xml_diff>